<commit_message>
feat: refonte visuelle landing — SVG éventail CadreCommun + fix données agrégées
</commit_message>
<xml_diff>
--- a/Note méthodologique V2.docx
+++ b/Note méthodologique V2.docx
@@ -1,17 +1,121 @@
 
 <file path=word/document.xml><?xml version="1.0" encoding="utf-8"?>
-<w:document xmlns:wpc="http://schemas.microsoft.com/office/word/2010/wordprocessingCanvas" xmlns:cx="http://schemas.microsoft.com/office/drawing/2014/chartex" xmlns:cx1="http://schemas.microsoft.com/office/drawing/2015/9/8/chartex" xmlns:cx2="http://schemas.microsoft.com/office/drawing/2015/10/21/chartex" xmlns:cx3="http://schemas.microsoft.com/office/drawing/2016/5/9/chartex" xmlns:cx4="http://schemas.microsoft.com/office/drawing/2016/5/10/chartex" xmlns:cx5="http://schemas.microsoft.com/office/drawing/2016/5/11/chartex" xmlns:cx6="http://schemas.microsoft.com/office/drawing/2016/5/12/chartex" xmlns:cx7="http://schemas.microsoft.com/office/drawing/2016/5/13/chartex" xmlns:cx8="http://schemas.microsoft.com/office/drawing/2016/5/14/chartex" xmlns:mc="http://schemas.openxmlformats.org/markup-compatibility/2006" xmlns:aink="http://schemas.microsoft.com/office/drawing/2016/ink" xmlns:am3d="http://schemas.microsoft.com/office/drawing/2017/model3d" xmlns:o="urn:schemas-microsoft-com:office:office" xmlns:r="http://schemas.openxmlformats.org/officeDocument/2006/relationships" xmlns:m="http://schemas.openxmlformats.org/officeDocument/2006/math" xmlns:v="urn:schemas-microsoft-com:vml" xmlns:wp14="http://schemas.microsoft.com/office/word/2010/wordprocessingDrawing" xmlns:wp="http://schemas.openxmlformats.org/drawingml/2006/wordprocessingDrawing" xmlns:w10="urn:schemas-microsoft-com:office:word" xmlns:w="http://schemas.openxmlformats.org/wordprocessingml/2006/main" xmlns:w14="http://schemas.microsoft.com/office/word/2010/wordml" xmlns:w15="http://schemas.microsoft.com/office/word/2012/wordml" xmlns:w16cex="http://schemas.microsoft.com/office/word/2018/wordml/cex" xmlns:w16cid="http://schemas.microsoft.com/office/word/2016/wordml/cid" xmlns:w16="http://schemas.microsoft.com/office/word/2018/wordml" xmlns:w16sdtdh="http://schemas.microsoft.com/office/word/2020/wordml/sdtdatahash" xmlns:w16se="http://schemas.microsoft.com/office/word/2015/wordml/symex" xmlns:wpg="http://schemas.microsoft.com/office/word/2010/wordprocessingGroup" xmlns:wpi="http://schemas.microsoft.com/office/word/2010/wordprocessingInk" xmlns:wne="http://schemas.microsoft.com/office/word/2006/wordml" xmlns:wps="http://schemas.microsoft.com/office/word/2010/wordprocessingShape" mc:Ignorable="w14 w15 w16se w16cid w16 w16cex w16sdtdh wp14">
+<w:document xmlns:wpc="http://schemas.microsoft.com/office/word/2010/wordprocessingCanvas" xmlns:cx="http://schemas.microsoft.com/office/drawing/2014/chartex" xmlns:cx1="http://schemas.microsoft.com/office/drawing/2015/9/8/chartex" xmlns:cx2="http://schemas.microsoft.com/office/drawing/2015/10/21/chartex" xmlns:cx3="http://schemas.microsoft.com/office/drawing/2016/5/9/chartex" xmlns:cx4="http://schemas.microsoft.com/office/drawing/2016/5/10/chartex" xmlns:cx5="http://schemas.microsoft.com/office/drawing/2016/5/11/chartex" xmlns:cx6="http://schemas.microsoft.com/office/drawing/2016/5/12/chartex" xmlns:cx7="http://schemas.microsoft.com/office/drawing/2016/5/13/chartex" xmlns:cx8="http://schemas.microsoft.com/office/drawing/2016/5/14/chartex" xmlns:mc="http://schemas.openxmlformats.org/markup-compatibility/2006" xmlns:aink="http://schemas.microsoft.com/office/drawing/2016/ink" xmlns:am3d="http://schemas.microsoft.com/office/drawing/2017/model3d" xmlns:o="urn:schemas-microsoft-com:office:office" xmlns:oel="http://schemas.microsoft.com/office/2019/extlst" xmlns:r="http://schemas.openxmlformats.org/officeDocument/2006/relationships" xmlns:m="http://schemas.openxmlformats.org/officeDocument/2006/math" xmlns:v="urn:schemas-microsoft-com:vml" xmlns:wp14="http://schemas.microsoft.com/office/word/2010/wordprocessingDrawing" xmlns:wp="http://schemas.openxmlformats.org/drawingml/2006/wordprocessingDrawing" xmlns:w10="urn:schemas-microsoft-com:office:word" xmlns:w="http://schemas.openxmlformats.org/wordprocessingml/2006/main" xmlns:w14="http://schemas.microsoft.com/office/word/2010/wordml" xmlns:w15="http://schemas.microsoft.com/office/word/2012/wordml" xmlns:w16cex="http://schemas.microsoft.com/office/word/2018/wordml/cex" xmlns:w16cid="http://schemas.microsoft.com/office/word/2016/wordml/cid" xmlns:w16="http://schemas.microsoft.com/office/word/2018/wordml" xmlns:w16du="http://schemas.microsoft.com/office/word/2023/wordml/word16du" xmlns:w16sdtdh="http://schemas.microsoft.com/office/word/2020/wordml/sdtdatahash" xmlns:w16sdtfl="http://schemas.microsoft.com/office/word/2024/wordml/sdtformatlock" xmlns:w16se="http://schemas.microsoft.com/office/word/2015/wordml/symex" xmlns:wpg="http://schemas.microsoft.com/office/word/2010/wordprocessingGroup" xmlns:wpi="http://schemas.microsoft.com/office/word/2010/wordprocessingInk" xmlns:wne="http://schemas.microsoft.com/office/word/2006/wordml" xmlns:wps="http://schemas.microsoft.com/office/word/2010/wordprocessingShape" mc:Ignorable="w14 w15 w16se w16cid w16 w16cex w16sdtdh w16sdtfl w16du wp14">
   <w:body>
     <w:p>
       <w:pPr>
         <w:pStyle w:val="Titre1"/>
-        <w:jc w:val="right"/>
         <w:rPr>
           <w:rFonts w:ascii="Arial" w:hAnsi="Arial" w:cs="Arial"/>
           <w:sz w:val="22"/>
           <w:szCs w:val="22"/>
         </w:rPr>
       </w:pPr>
+      <w:r>
+        <w:rPr>
+          <w:rFonts w:ascii="Arial" w:hAnsi="Arial" w:cs="Arial"/>
+          <w:noProof/>
+          <w:sz w:val="22"/>
+          <w:szCs w:val="22"/>
+        </w:rPr>
+        <w:drawing>
+          <wp:inline distT="0" distB="0" distL="0" distR="0" wp14:anchorId="2CF06C86" wp14:editId="638CDAC5">
+            <wp:extent cx="1155700" cy="575223"/>
+            <wp:effectExtent l="0" t="0" r="0" b="0"/>
+            <wp:docPr id="1938716134" name="Image 1"/>
+            <wp:cNvGraphicFramePr>
+              <a:graphicFrameLocks xmlns:a="http://schemas.openxmlformats.org/drawingml/2006/main" noChangeAspect="1"/>
+            </wp:cNvGraphicFramePr>
+            <a:graphic xmlns:a="http://schemas.openxmlformats.org/drawingml/2006/main">
+              <a:graphicData uri="http://schemas.openxmlformats.org/drawingml/2006/picture">
+                <pic:pic xmlns:pic="http://schemas.openxmlformats.org/drawingml/2006/picture">
+                  <pic:nvPicPr>
+                    <pic:cNvPr id="1938716134" name="Image 1938716134"/>
+                    <pic:cNvPicPr/>
+                  </pic:nvPicPr>
+                  <pic:blipFill>
+                    <a:blip r:embed="rId5" cstate="print">
+                      <a:extLst>
+                        <a:ext uri="{28A0092B-C50C-407E-A947-70E740481C1C}">
+                          <a14:useLocalDpi xmlns:a14="http://schemas.microsoft.com/office/drawing/2010/main" val="0"/>
+                        </a:ext>
+                      </a:extLst>
+                    </a:blip>
+                    <a:stretch>
+                      <a:fillRect/>
+                    </a:stretch>
+                  </pic:blipFill>
+                  <pic:spPr>
+                    <a:xfrm>
+                      <a:off x="0" y="0"/>
+                      <a:ext cx="1199999" cy="597272"/>
+                    </a:xfrm>
+                    <a:prstGeom prst="rect">
+                      <a:avLst/>
+                    </a:prstGeom>
+                  </pic:spPr>
+                </pic:pic>
+              </a:graphicData>
+            </a:graphic>
+          </wp:inline>
+        </w:drawing>
+      </w:r>
+      <w:r>
+        <w:rPr>
+          <w:rFonts w:ascii="Arial" w:hAnsi="Arial" w:cs="Arial"/>
+          <w:sz w:val="22"/>
+          <w:szCs w:val="22"/>
+        </w:rPr>
+        <w:tab/>
+      </w:r>
+      <w:r>
+        <w:rPr>
+          <w:rFonts w:ascii="Arial" w:hAnsi="Arial" w:cs="Arial"/>
+          <w:sz w:val="22"/>
+          <w:szCs w:val="22"/>
+        </w:rPr>
+        <w:tab/>
+      </w:r>
+      <w:r>
+        <w:rPr>
+          <w:rFonts w:ascii="Arial" w:hAnsi="Arial" w:cs="Arial"/>
+          <w:sz w:val="22"/>
+          <w:szCs w:val="22"/>
+        </w:rPr>
+        <w:tab/>
+      </w:r>
+      <w:r>
+        <w:rPr>
+          <w:rFonts w:ascii="Arial" w:hAnsi="Arial" w:cs="Arial"/>
+          <w:sz w:val="22"/>
+          <w:szCs w:val="22"/>
+        </w:rPr>
+        <w:tab/>
+      </w:r>
+      <w:r>
+        <w:rPr>
+          <w:rFonts w:ascii="Arial" w:hAnsi="Arial" w:cs="Arial"/>
+          <w:sz w:val="22"/>
+          <w:szCs w:val="22"/>
+        </w:rPr>
+        <w:tab/>
+      </w:r>
+      <w:r>
+        <w:rPr>
+          <w:rFonts w:ascii="Arial" w:hAnsi="Arial" w:cs="Arial"/>
+          <w:sz w:val="22"/>
+          <w:szCs w:val="22"/>
+        </w:rPr>
+        <w:tab/>
+      </w:r>
+      <w:r>
+        <w:rPr>
+          <w:rFonts w:ascii="Arial" w:hAnsi="Arial" w:cs="Arial"/>
+          <w:sz w:val="22"/>
+          <w:szCs w:val="22"/>
+        </w:rPr>
+        <w:tab/>
+      </w:r>
       <w:r>
         <w:rPr>
           <w:rFonts w:ascii="Arial" w:hAnsi="Arial" w:cs="Arial"/>
@@ -58,23 +162,7 @@
           <w:sz w:val="28"/>
           <w:szCs w:val="28"/>
         </w:rPr>
-        <w:t>Suivi</w:t>
-      </w:r>
-      <w:r>
-        <w:rPr>
-          <w:rFonts w:ascii="Arial" w:hAnsi="Arial" w:cs="Arial"/>
-          <w:sz w:val="28"/>
-          <w:szCs w:val="28"/>
-        </w:rPr>
-        <w:t xml:space="preserve"> et documentation des </w:t>
-      </w:r>
-      <w:r>
-        <w:rPr>
-          <w:rFonts w:ascii="Arial" w:hAnsi="Arial" w:cs="Arial"/>
-          <w:sz w:val="28"/>
-          <w:szCs w:val="28"/>
-        </w:rPr>
-        <w:t>résultats de l’emploi des jeunes dans les projets</w:t>
+        <w:t>Suivi et documentation des résultats de l’emploi des jeunes dans les projets</w:t>
       </w:r>
     </w:p>
     <w:p>
@@ -413,21 +501,7 @@
           <w:rFonts w:ascii="Arial" w:eastAsia="Times New Roman" w:hAnsi="Arial" w:cs="Arial"/>
           <w:lang w:eastAsia="fr-FR"/>
         </w:rPr>
-        <w:t xml:space="preserve"> conditions.</w:t>
-      </w:r>
-      <w:r>
-        <w:rPr>
-          <w:rFonts w:ascii="Arial" w:eastAsia="Times New Roman" w:hAnsi="Arial" w:cs="Arial"/>
-          <w:lang w:eastAsia="fr-FR"/>
-        </w:rPr>
-        <w:t xml:space="preserve"> </w:t>
-      </w:r>
-      <w:r>
-        <w:rPr>
-          <w:rFonts w:ascii="Arial" w:eastAsia="Times New Roman" w:hAnsi="Arial" w:cs="Arial"/>
-          <w:lang w:eastAsia="fr-FR"/>
-        </w:rPr>
-        <w:t xml:space="preserve">La première est la </w:t>
+        <w:t xml:space="preserve"> conditions. La première est la </w:t>
       </w:r>
       <w:r>
         <w:rPr>
@@ -443,21 +517,7 @@
           <w:rFonts w:ascii="Arial" w:eastAsia="Times New Roman" w:hAnsi="Arial" w:cs="Arial"/>
           <w:lang w:eastAsia="fr-FR"/>
         </w:rPr>
-        <w:t>, sans laquelle la constitution des bases A1 et B1 risque d’être retardée.</w:t>
-      </w:r>
-      <w:r>
-        <w:rPr>
-          <w:rFonts w:ascii="Arial" w:eastAsia="Times New Roman" w:hAnsi="Arial" w:cs="Arial"/>
-          <w:lang w:eastAsia="fr-FR"/>
-        </w:rPr>
-        <w:t xml:space="preserve"> </w:t>
-      </w:r>
-      <w:r>
-        <w:rPr>
-          <w:rFonts w:ascii="Arial" w:eastAsia="Times New Roman" w:hAnsi="Arial" w:cs="Arial"/>
-          <w:lang w:eastAsia="fr-FR"/>
-        </w:rPr>
-        <w:t xml:space="preserve">La deuxième est la </w:t>
+        <w:t xml:space="preserve">, sans laquelle la constitution des bases A1 et B1 risque d’être retardée. La deuxième est la </w:t>
       </w:r>
       <w:r>
         <w:rPr>
@@ -504,7 +564,6 @@
           <w:bCs/>
           <w:lang w:eastAsia="fr-FR"/>
         </w:rPr>
-        <w:lastRenderedPageBreak/>
         <w:t>2</w:t>
       </w:r>
       <w:r>
@@ -531,21 +590,7 @@
           <w:rFonts w:ascii="Arial" w:eastAsia="Times New Roman" w:hAnsi="Arial" w:cs="Arial"/>
           <w:lang w:eastAsia="fr-FR"/>
         </w:rPr>
-        <w:t xml:space="preserve">L’approche à retenir </w:t>
-      </w:r>
-      <w:r>
-        <w:rPr>
-          <w:rFonts w:ascii="Arial" w:eastAsia="Times New Roman" w:hAnsi="Arial" w:cs="Arial"/>
-          <w:lang w:eastAsia="fr-FR"/>
-        </w:rPr>
-        <w:t>peut-être</w:t>
-      </w:r>
-      <w:r>
-        <w:rPr>
-          <w:rFonts w:ascii="Arial" w:eastAsia="Times New Roman" w:hAnsi="Arial" w:cs="Arial"/>
-          <w:lang w:eastAsia="fr-FR"/>
-        </w:rPr>
-        <w:t xml:space="preserve"> présentée comme un processus en deux volets complémentaires.</w:t>
+        <w:t>L’approche à retenir peut-être présentée comme un processus en deux volets complémentaires.</w:t>
       </w:r>
     </w:p>
     <w:p>
@@ -628,14 +673,7 @@
           <w:rFonts w:ascii="Arial" w:eastAsia="Times New Roman" w:hAnsi="Arial" w:cs="Arial"/>
           <w:lang w:eastAsia="fr-FR"/>
         </w:rPr>
-        <w:t xml:space="preserve">Il convient de souligner que tous les indicateurs ne relèvent pas du même mode de renseignement. Certains peuvent être documentés de manière quasi exhaustive à partir des données </w:t>
-      </w:r>
-      <w:r>
-        <w:rPr>
-          <w:rFonts w:ascii="Arial" w:eastAsia="Times New Roman" w:hAnsi="Arial" w:cs="Arial"/>
-          <w:lang w:eastAsia="fr-FR"/>
-        </w:rPr>
-        <w:t xml:space="preserve">sur les personnes formées et les </w:t>
+        <w:t xml:space="preserve">Il convient de souligner que tous les indicateurs ne relèvent pas du même mode de renseignement. Certains peuvent être documentés de manière quasi exhaustive à partir des données sur les personnes formées et les </w:t>
       </w:r>
       <w:r>
         <w:rPr>
@@ -691,7 +729,6 @@
         <w:rPr>
           <w:rFonts w:ascii="Arial" w:eastAsia="Times New Roman" w:hAnsi="Arial" w:cs="Arial"/>
           <w:color w:val="000000"/>
-          <w:highlight w:val="yellow"/>
           <w:bdr w:val="none" w:sz="0" w:space="0" w:color="auto" w:frame="1"/>
           <w:lang w:eastAsia="fr-FR"/>
         </w:rPr>
@@ -700,7 +737,6 @@
         <w:rPr>
           <w:rFonts w:ascii="Arial" w:eastAsia="Times New Roman" w:hAnsi="Arial" w:cs="Arial"/>
           <w:color w:val="000000"/>
-          <w:highlight w:val="yellow"/>
           <w:bdr w:val="none" w:sz="0" w:space="0" w:color="auto" w:frame="1"/>
           <w:lang w:eastAsia="fr-FR"/>
         </w:rPr>
@@ -715,7 +751,6 @@
         <w:rPr>
           <w:rFonts w:ascii="Arial" w:eastAsia="Times New Roman" w:hAnsi="Arial" w:cs="Arial"/>
           <w:color w:val="000000"/>
-          <w:highlight w:val="yellow"/>
           <w:bdr w:val="none" w:sz="0" w:space="0" w:color="auto" w:frame="1"/>
           <w:lang w:eastAsia="fr-FR"/>
         </w:rPr>
@@ -724,7 +759,6 @@
         <w:rPr>
           <w:rFonts w:ascii="Arial" w:eastAsia="Times New Roman" w:hAnsi="Arial" w:cs="Arial"/>
           <w:color w:val="000000"/>
-          <w:highlight w:val="yellow"/>
           <w:bdr w:val="none" w:sz="0" w:space="0" w:color="auto" w:frame="1"/>
           <w:lang w:eastAsia="fr-FR"/>
         </w:rPr>
@@ -739,7 +773,6 @@
         <w:rPr>
           <w:rFonts w:ascii="Arial" w:eastAsia="Times New Roman" w:hAnsi="Arial" w:cs="Arial"/>
           <w:color w:val="000000"/>
-          <w:highlight w:val="yellow"/>
           <w:bdr w:val="none" w:sz="0" w:space="0" w:color="auto" w:frame="1"/>
           <w:lang w:eastAsia="fr-FR"/>
         </w:rPr>
@@ -748,7 +781,6 @@
         <w:rPr>
           <w:rFonts w:ascii="Arial" w:eastAsia="Times New Roman" w:hAnsi="Arial" w:cs="Arial"/>
           <w:color w:val="000000"/>
-          <w:highlight w:val="yellow"/>
           <w:bdr w:val="none" w:sz="0" w:space="0" w:color="auto" w:frame="1"/>
           <w:lang w:eastAsia="fr-FR"/>
         </w:rPr>
@@ -845,7 +877,15 @@
           <w:rFonts w:ascii="Arial" w:eastAsia="Times New Roman" w:hAnsi="Arial" w:cs="Arial"/>
           <w:lang w:eastAsia="fr-FR"/>
         </w:rPr>
-        <w:t>La base construite à partir de l’indicateur A1 doit rassembler l’ensemble des jeunes ayant effectivement participé à une formation soutenue par l’OIF dans le cadre des projets concernés. Elle constitue l’univers de référence principal pour le suivi des indicateurs de la catégorie A, et plus largement pour tous les indicateurs qui supposent un contact direct avec les bénéficiaires individuels.</w:t>
+        <w:t xml:space="preserve">La base construite à partir de l’indicateur A1 doit rassembler l’ensemble des jeunes ayant effectivement participé à une formation soutenue par l’OIF dans le cadre des projets concernés. Elle constitue l’univers de référence principal pour le suivi des indicateurs de la </w:t>
+      </w:r>
+      <w:r>
+        <w:rPr>
+          <w:rFonts w:ascii="Arial" w:eastAsia="Times New Roman" w:hAnsi="Arial" w:cs="Arial"/>
+          <w:lang w:eastAsia="fr-FR"/>
+        </w:rPr>
+        <w:lastRenderedPageBreak/>
+        <w:t>catégorie A, et plus largement pour tous les indicateurs qui supposent un contact direct avec les bénéficiaires individuels.</w:t>
       </w:r>
     </w:p>
     <w:p>
@@ -862,8 +902,299 @@
           <w:rFonts w:ascii="Arial" w:eastAsia="Times New Roman" w:hAnsi="Arial" w:cs="Arial"/>
           <w:lang w:eastAsia="fr-FR"/>
         </w:rPr>
+        <w:t>Cette base devra être constituée à partir des listes de présence, des fiches d’inscription, des bases de données des opérateurs et, le cas échéant, des plateformes de formation. Elle devra être consolidée et harmonisée afin de rendre les données comparables entre projets, partenaires et pays.</w:t>
+      </w:r>
+    </w:p>
+    <w:p>
+      <w:pPr>
+        <w:spacing w:before="100" w:beforeAutospacing="1" w:after="100" w:afterAutospacing="1" w:line="240" w:lineRule="auto"/>
+        <w:jc w:val="both"/>
+        <w:rPr>
+          <w:rFonts w:ascii="Arial" w:eastAsia="Times New Roman" w:hAnsi="Arial" w:cs="Arial"/>
+          <w:lang w:eastAsia="fr-FR"/>
+        </w:rPr>
+      </w:pPr>
+      <w:r>
+        <w:rPr>
+          <w:rFonts w:ascii="Arial" w:eastAsia="Times New Roman" w:hAnsi="Arial" w:cs="Arial"/>
+          <w:lang w:eastAsia="fr-FR"/>
+        </w:rPr>
+        <w:t xml:space="preserve">Pour être exploitable comme base de sondage, cette liste devra comprendre, au minimum, un identifiant unique, l’identité du bénéficiaire, le sexe, l’âge ou la tranche d’âge, le projet de rattachement, le type de formation suivie, les dates de participation, ainsi que des informations de contact fiables permettant une </w:t>
+      </w:r>
+      <w:r>
+        <w:rPr>
+          <w:rFonts w:ascii="Arial" w:eastAsia="Times New Roman" w:hAnsi="Arial" w:cs="Arial"/>
+          <w:lang w:eastAsia="fr-FR"/>
+        </w:rPr>
+        <w:t>enquête</w:t>
+      </w:r>
+      <w:r>
+        <w:rPr>
+          <w:rFonts w:ascii="Arial" w:eastAsia="Times New Roman" w:hAnsi="Arial" w:cs="Arial"/>
+          <w:lang w:eastAsia="fr-FR"/>
+        </w:rPr>
+        <w:t xml:space="preserve"> </w:t>
+      </w:r>
+      <w:r>
+        <w:rPr>
+          <w:rFonts w:ascii="Arial" w:eastAsia="Times New Roman" w:hAnsi="Arial" w:cs="Arial"/>
+          <w:lang w:eastAsia="fr-FR"/>
+        </w:rPr>
+        <w:t>en ligne</w:t>
+      </w:r>
+      <w:r>
+        <w:rPr>
+          <w:rFonts w:ascii="Arial" w:eastAsia="Times New Roman" w:hAnsi="Arial" w:cs="Arial"/>
+          <w:lang w:eastAsia="fr-FR"/>
+        </w:rPr>
+        <w:t xml:space="preserve"> ou par messagerie.</w:t>
+      </w:r>
+    </w:p>
+    <w:p>
+      <w:pPr>
+        <w:spacing w:before="100" w:beforeAutospacing="1" w:after="100" w:afterAutospacing="1" w:line="240" w:lineRule="auto"/>
+        <w:jc w:val="both"/>
+        <w:rPr>
+          <w:rFonts w:ascii="Arial" w:eastAsia="Times New Roman" w:hAnsi="Arial" w:cs="Arial"/>
+          <w:lang w:eastAsia="fr-FR"/>
+        </w:rPr>
+      </w:pPr>
+      <w:r>
+        <w:rPr>
+          <w:rFonts w:ascii="Arial" w:eastAsia="Times New Roman" w:hAnsi="Arial" w:cs="Arial"/>
+          <w:lang w:eastAsia="fr-FR"/>
+        </w:rPr>
+        <w:t>Au-delà de la simple compilation des listes, un travail de nettoyage sera indispensable. Il faudra notamment éliminer les doublons, harmoniser les noms de projets et de partenaires, vérifier les coordonnées, distinguer les inscrits des participants effectifs et repérer les cohortes pour lesquelles un suivi d’insertion à 6 mois ou 12 mois est déjà méthodologiquement possible.</w:t>
+      </w:r>
+    </w:p>
+    <w:p>
+      <w:pPr>
+        <w:spacing w:before="100" w:beforeAutospacing="1" w:after="100" w:afterAutospacing="1" w:line="240" w:lineRule="auto"/>
+        <w:outlineLvl w:val="2"/>
+        <w:rPr>
+          <w:rFonts w:ascii="Arial" w:eastAsia="Times New Roman" w:hAnsi="Arial" w:cs="Arial"/>
+          <w:b/>
+          <w:bCs/>
+          <w:lang w:eastAsia="fr-FR"/>
+        </w:rPr>
+      </w:pPr>
+      <w:r>
+        <w:rPr>
+          <w:rFonts w:ascii="Arial" w:eastAsia="Times New Roman" w:hAnsi="Arial" w:cs="Arial"/>
+          <w:b/>
+          <w:bCs/>
+          <w:lang w:eastAsia="fr-FR"/>
+        </w:rPr>
+        <w:t>3</w:t>
+      </w:r>
+      <w:r>
+        <w:rPr>
+          <w:rFonts w:ascii="Arial" w:eastAsia="Times New Roman" w:hAnsi="Arial" w:cs="Arial"/>
+          <w:b/>
+          <w:bCs/>
+          <w:lang w:eastAsia="fr-FR"/>
+        </w:rPr>
+        <w:t>.2. Base de sondage issue de B1 : les activités économiques appuyées</w:t>
+      </w:r>
+    </w:p>
+    <w:p>
+      <w:pPr>
+        <w:spacing w:before="100" w:beforeAutospacing="1" w:after="100" w:afterAutospacing="1" w:line="240" w:lineRule="auto"/>
+        <w:jc w:val="both"/>
+        <w:rPr>
+          <w:rFonts w:ascii="Arial" w:eastAsia="Times New Roman" w:hAnsi="Arial" w:cs="Arial"/>
+          <w:lang w:eastAsia="fr-FR"/>
+        </w:rPr>
+      </w:pPr>
+      <w:r>
+        <w:rPr>
+          <w:rFonts w:ascii="Arial" w:eastAsia="Times New Roman" w:hAnsi="Arial" w:cs="Arial"/>
+          <w:lang w:eastAsia="fr-FR"/>
+        </w:rPr>
+        <w:t>La base construite à partir de l’indicateur B1 doit recenser l’ensemble des activités économiques appuyées par l’OIF, qu’il s’agisse d’AGR, de micro-entreprises, de coopératives, de très petites structures ou d’autres initiatives à potentiel économique. Elle constitue l’univers de référence pour le suivi des indicateurs de la catégorie B.</w:t>
+      </w:r>
+    </w:p>
+    <w:p>
+      <w:pPr>
+        <w:spacing w:before="100" w:beforeAutospacing="1" w:after="100" w:afterAutospacing="1" w:line="240" w:lineRule="auto"/>
+        <w:rPr>
+          <w:rFonts w:ascii="Arial" w:eastAsia="Times New Roman" w:hAnsi="Arial" w:cs="Arial"/>
+          <w:lang w:eastAsia="fr-FR"/>
+        </w:rPr>
+      </w:pPr>
+      <w:r>
+        <w:rPr>
+          <w:rFonts w:ascii="Arial" w:eastAsia="Times New Roman" w:hAnsi="Arial" w:cs="Arial"/>
+          <w:lang w:eastAsia="fr-FR"/>
+        </w:rPr>
+        <w:t>Cette base devra être alimentée à partir des PAS, des conventions, des rapports financiers, des fichiers de suivi des projets et des informations détenues par les partenaires de mise en œuvre. Elle devra, elle aussi, être harmonisée et nettoyée.</w:t>
+      </w:r>
+    </w:p>
+    <w:p>
+      <w:pPr>
+        <w:spacing w:before="100" w:beforeAutospacing="1" w:after="100" w:afterAutospacing="1" w:line="240" w:lineRule="auto"/>
+        <w:rPr>
+          <w:rFonts w:ascii="Arial" w:eastAsia="Times New Roman" w:hAnsi="Arial" w:cs="Arial"/>
+          <w:lang w:eastAsia="fr-FR"/>
+        </w:rPr>
+      </w:pPr>
+      <w:r>
+        <w:rPr>
+          <w:rFonts w:ascii="Arial" w:eastAsia="Times New Roman" w:hAnsi="Arial" w:cs="Arial"/>
+          <w:lang w:eastAsia="fr-FR"/>
+        </w:rPr>
+        <w:t>Pour chaque structure, il conviendra de renseigner un identifiant, le nom de la structure ou du porteur, le sexe et, si possible, l’âge du porteur principal, le pays et la localité, le secteur d’activité, la date de création, la date de l’appui, la nature et le montant de l’appui, ainsi que les coordonnées permettant le suivi</w:t>
+      </w:r>
+      <w:r>
+        <w:rPr>
+          <w:rFonts w:ascii="Arial" w:eastAsia="Times New Roman" w:hAnsi="Arial" w:cs="Arial"/>
+          <w:lang w:eastAsia="fr-FR"/>
+        </w:rPr>
+        <w:t xml:space="preserve"> à distance</w:t>
+      </w:r>
+      <w:r>
+        <w:rPr>
+          <w:rFonts w:ascii="Arial" w:eastAsia="Times New Roman" w:hAnsi="Arial" w:cs="Arial"/>
+          <w:lang w:eastAsia="fr-FR"/>
+        </w:rPr>
+        <w:t>.</w:t>
+      </w:r>
+    </w:p>
+    <w:p>
+      <w:pPr>
+        <w:spacing w:before="100" w:beforeAutospacing="1" w:after="100" w:afterAutospacing="1" w:line="240" w:lineRule="auto"/>
+        <w:jc w:val="both"/>
+        <w:rPr>
+          <w:rFonts w:ascii="Arial" w:eastAsia="Times New Roman" w:hAnsi="Arial" w:cs="Arial"/>
+          <w:lang w:eastAsia="fr-FR"/>
+        </w:rPr>
+      </w:pPr>
+      <w:r>
+        <w:rPr>
+          <w:rFonts w:ascii="Arial" w:eastAsia="Times New Roman" w:hAnsi="Arial" w:cs="Arial"/>
+          <w:lang w:eastAsia="fr-FR"/>
+        </w:rPr>
+        <w:t>Le nettoyage de cette base devra permettre de distinguer clairement les structures nouvellement créées des structures préexistantes renforcées, d’éviter les doubles comptes liés à plusieurs appuis accordés à une même structure et de fiabiliser les informations de contact.</w:t>
+      </w:r>
+    </w:p>
+    <w:p>
+      <w:pPr>
+        <w:spacing w:before="100" w:beforeAutospacing="1" w:after="100" w:afterAutospacing="1" w:line="240" w:lineRule="auto"/>
+        <w:outlineLvl w:val="1"/>
+        <w:rPr>
+          <w:rFonts w:ascii="Arial" w:eastAsia="Times New Roman" w:hAnsi="Arial" w:cs="Arial"/>
+          <w:b/>
+          <w:bCs/>
+          <w:lang w:eastAsia="fr-FR"/>
+        </w:rPr>
+      </w:pPr>
+      <w:r>
+        <w:rPr>
+          <w:rFonts w:ascii="Arial" w:eastAsia="Times New Roman" w:hAnsi="Arial" w:cs="Arial"/>
+          <w:b/>
+          <w:bCs/>
+          <w:lang w:eastAsia="fr-FR"/>
+        </w:rPr>
+        <w:t>4</w:t>
+      </w:r>
+      <w:r>
+        <w:rPr>
+          <w:rFonts w:ascii="Arial" w:eastAsia="Times New Roman" w:hAnsi="Arial" w:cs="Arial"/>
+          <w:b/>
+          <w:bCs/>
+          <w:lang w:eastAsia="fr-FR"/>
+        </w:rPr>
+        <w:t>. Utilisation des bases de sondage pour la documentation des autres indicateurs</w:t>
+      </w:r>
+    </w:p>
+    <w:p>
+      <w:pPr>
+        <w:spacing w:before="100" w:beforeAutospacing="1" w:after="100" w:afterAutospacing="1" w:line="240" w:lineRule="auto"/>
+        <w:rPr>
+          <w:rFonts w:ascii="Arial" w:eastAsia="Times New Roman" w:hAnsi="Arial" w:cs="Arial"/>
+          <w:lang w:eastAsia="fr-FR"/>
+        </w:rPr>
+      </w:pPr>
+      <w:r>
+        <w:rPr>
+          <w:rFonts w:ascii="Arial" w:eastAsia="Times New Roman" w:hAnsi="Arial" w:cs="Arial"/>
+          <w:lang w:eastAsia="fr-FR"/>
+        </w:rPr>
+        <w:t>Une fois les bases A1 et B1 constituées, elles pourront être mobilisées comme socle pour le renseignement des autres indicateurs.</w:t>
+      </w:r>
+    </w:p>
+    <w:p>
+      <w:pPr>
+        <w:spacing w:before="100" w:beforeAutospacing="1" w:after="100" w:afterAutospacing="1" w:line="240" w:lineRule="auto"/>
+        <w:jc w:val="both"/>
+        <w:rPr>
+          <w:rFonts w:ascii="Arial" w:eastAsia="Times New Roman" w:hAnsi="Arial" w:cs="Arial"/>
+          <w:lang w:eastAsia="fr-FR"/>
+        </w:rPr>
+      </w:pPr>
+      <w:r>
+        <w:rPr>
+          <w:rFonts w:ascii="Arial" w:eastAsia="Times New Roman" w:hAnsi="Arial" w:cs="Arial"/>
+          <w:lang w:eastAsia="fr-FR"/>
+        </w:rPr>
+        <w:t xml:space="preserve">La base des </w:t>
+      </w:r>
+      <w:r>
+        <w:rPr>
+          <w:rFonts w:ascii="Arial" w:eastAsia="Times New Roman" w:hAnsi="Arial" w:cs="Arial"/>
+          <w:b/>
+          <w:bCs/>
+          <w:lang w:eastAsia="fr-FR"/>
+        </w:rPr>
+        <w:t>jeunes formés</w:t>
+      </w:r>
+      <w:r>
+        <w:rPr>
+          <w:rFonts w:ascii="Arial" w:eastAsia="Times New Roman" w:hAnsi="Arial" w:cs="Arial"/>
+          <w:lang w:eastAsia="fr-FR"/>
+        </w:rPr>
+        <w:t xml:space="preserve"> permettra de documenter les indicateurs relatifs à l’achèvement des formations, à la certification, au gain de compétences, à l’insertion professionnelle, à l’utilité perçue de l’appui et, le cas échéant, à l’apport du français à l’employabilité. Elle servira donc à la fois à des calculs exhaustifs lorsque les données existent déjà dans les dispositifs de formation, et à des enquêtes ciblées lorsque l’information n’est pas disponible dans les sources administratives.</w:t>
+      </w:r>
+    </w:p>
+    <w:p>
+      <w:pPr>
+        <w:spacing w:before="100" w:beforeAutospacing="1" w:after="100" w:afterAutospacing="1" w:line="240" w:lineRule="auto"/>
+        <w:jc w:val="both"/>
+        <w:rPr>
+          <w:rFonts w:ascii="Arial" w:eastAsia="Times New Roman" w:hAnsi="Arial" w:cs="Arial"/>
+          <w:lang w:eastAsia="fr-FR"/>
+        </w:rPr>
+      </w:pPr>
+      <w:r>
+        <w:rPr>
+          <w:rFonts w:ascii="Arial" w:eastAsia="Times New Roman" w:hAnsi="Arial" w:cs="Arial"/>
+          <w:lang w:eastAsia="fr-FR"/>
+        </w:rPr>
+        <w:t xml:space="preserve">La base des </w:t>
+      </w:r>
+      <w:r>
+        <w:rPr>
+          <w:rFonts w:ascii="Arial" w:eastAsia="Times New Roman" w:hAnsi="Arial" w:cs="Arial"/>
+          <w:b/>
+          <w:bCs/>
+          <w:lang w:eastAsia="fr-FR"/>
+        </w:rPr>
+        <w:t>activités économiques appuyées</w:t>
+      </w:r>
+      <w:r>
+        <w:rPr>
+          <w:rFonts w:ascii="Arial" w:eastAsia="Times New Roman" w:hAnsi="Arial" w:cs="Arial"/>
+          <w:lang w:eastAsia="fr-FR"/>
+        </w:rPr>
+        <w:t xml:space="preserve"> permettra, quant à elle, de documenter les indicateurs relatifs à la survie des structures, aux emplois créés ou maintenus, et à certains </w:t>
+      </w:r>
+      <w:r>
+        <w:rPr>
+          <w:rFonts w:ascii="Arial" w:eastAsia="Times New Roman" w:hAnsi="Arial" w:cs="Arial"/>
+          <w:lang w:eastAsia="fr-FR"/>
+        </w:rPr>
         <w:lastRenderedPageBreak/>
-        <w:t>Cette base devra être constituée à partir des listes de présence, des fiches d’inscription, des bases de données des opérateurs et, le cas échéant, des plateformes de formation. Elle devra être consolidée et harmonisée afin de rendre les données comparables entre projets, partenaires et pays.</w:t>
+        <w:t>effets économiques indirects, à partir d’enquêtes de suivi ou de modules spécifiques adressés aux porteurs d’activités.</w:t>
       </w:r>
     </w:p>
     <w:p>
@@ -880,14 +1211,100 @@
           <w:rFonts w:ascii="Arial" w:eastAsia="Times New Roman" w:hAnsi="Arial" w:cs="Arial"/>
           <w:lang w:eastAsia="fr-FR"/>
         </w:rPr>
-        <w:t xml:space="preserve">Pour être exploitable comme base de sondage, cette liste devra comprendre, au minimum, un identifiant unique, l’identité du bénéficiaire, le sexe, l’âge ou la tranche d’âge, le projet de rattachement, le type de formation suivie, les dates de participation, ainsi que des informations de contact fiables permettant une </w:t>
-      </w:r>
-      <w:r>
-        <w:rPr>
-          <w:rFonts w:ascii="Arial" w:eastAsia="Times New Roman" w:hAnsi="Arial" w:cs="Arial"/>
-          <w:lang w:eastAsia="fr-FR"/>
-        </w:rPr>
-        <w:t>enquête</w:t>
+        <w:t xml:space="preserve">Ainsi, la base de sondage n’est pas seulement un instrument technique permettant de sélectionner des unités d’enquête. Elle constitue le </w:t>
+      </w:r>
+      <w:r>
+        <w:rPr>
+          <w:rFonts w:ascii="Arial" w:eastAsia="Times New Roman" w:hAnsi="Arial" w:cs="Arial"/>
+          <w:b/>
+          <w:bCs/>
+          <w:lang w:eastAsia="fr-FR"/>
+        </w:rPr>
+        <w:t>pivot méthodologique</w:t>
+      </w:r>
+      <w:r>
+        <w:rPr>
+          <w:rFonts w:ascii="Arial" w:eastAsia="Times New Roman" w:hAnsi="Arial" w:cs="Arial"/>
+          <w:lang w:eastAsia="fr-FR"/>
+        </w:rPr>
+        <w:t xml:space="preserve"> de l’ensemble du dispositif de documentation.</w:t>
+      </w:r>
+    </w:p>
+    <w:p>
+      <w:pPr>
+        <w:spacing w:before="100" w:beforeAutospacing="1" w:after="100" w:afterAutospacing="1" w:line="240" w:lineRule="auto"/>
+        <w:outlineLvl w:val="1"/>
+        <w:rPr>
+          <w:rFonts w:ascii="Arial" w:eastAsia="Times New Roman" w:hAnsi="Arial" w:cs="Arial"/>
+          <w:b/>
+          <w:bCs/>
+          <w:lang w:eastAsia="fr-FR"/>
+        </w:rPr>
+      </w:pPr>
+      <w:r>
+        <w:rPr>
+          <w:rFonts w:ascii="Arial" w:eastAsia="Times New Roman" w:hAnsi="Arial" w:cs="Arial"/>
+          <w:b/>
+          <w:bCs/>
+          <w:lang w:eastAsia="fr-FR"/>
+        </w:rPr>
+        <w:t>5</w:t>
+      </w:r>
+      <w:r>
+        <w:rPr>
+          <w:rFonts w:ascii="Arial" w:eastAsia="Times New Roman" w:hAnsi="Arial" w:cs="Arial"/>
+          <w:b/>
+          <w:bCs/>
+          <w:lang w:eastAsia="fr-FR"/>
+        </w:rPr>
+        <w:t>. Modalités de documentation par catégorie d’indicateurs</w:t>
+      </w:r>
+    </w:p>
+    <w:p>
+      <w:pPr>
+        <w:spacing w:before="100" w:beforeAutospacing="1" w:after="100" w:afterAutospacing="1" w:line="240" w:lineRule="auto"/>
+        <w:outlineLvl w:val="2"/>
+        <w:rPr>
+          <w:rFonts w:ascii="Arial" w:eastAsia="Times New Roman" w:hAnsi="Arial" w:cs="Arial"/>
+          <w:b/>
+          <w:bCs/>
+          <w:lang w:eastAsia="fr-FR"/>
+        </w:rPr>
+      </w:pPr>
+      <w:r>
+        <w:rPr>
+          <w:rFonts w:ascii="Arial" w:eastAsia="Times New Roman" w:hAnsi="Arial" w:cs="Arial"/>
+          <w:b/>
+          <w:bCs/>
+          <w:lang w:eastAsia="fr-FR"/>
+        </w:rPr>
+        <w:t>5</w:t>
+      </w:r>
+      <w:r>
+        <w:rPr>
+          <w:rFonts w:ascii="Arial" w:eastAsia="Times New Roman" w:hAnsi="Arial" w:cs="Arial"/>
+          <w:b/>
+          <w:bCs/>
+          <w:lang w:eastAsia="fr-FR"/>
+        </w:rPr>
+        <w:t>.1. Indicateurs de la catégorie A</w:t>
+      </w:r>
+    </w:p>
+    <w:p>
+      <w:pPr>
+        <w:spacing w:before="100" w:beforeAutospacing="1" w:after="100" w:afterAutospacing="1" w:line="240" w:lineRule="auto"/>
+        <w:jc w:val="both"/>
+        <w:rPr>
+          <w:rFonts w:ascii="Arial" w:eastAsia="Times New Roman" w:hAnsi="Arial" w:cs="Arial"/>
+          <w:lang w:eastAsia="fr-FR"/>
+        </w:rPr>
+      </w:pPr>
+      <w:r>
+        <w:rPr>
+          <w:rFonts w:ascii="Arial" w:eastAsia="Times New Roman" w:hAnsi="Arial" w:cs="Arial"/>
+          <w:lang w:eastAsia="fr-FR"/>
+        </w:rPr>
+        <w:t>Les indicateurs A1 à A5 relèvent d’une logique de suivi des parcours individuels. Tous ne demandent pas le même effort méthodologique.</w:t>
       </w:r>
       <w:r>
         <w:rPr>
@@ -901,14 +1318,23 @@
           <w:rFonts w:ascii="Arial" w:eastAsia="Times New Roman" w:hAnsi="Arial" w:cs="Arial"/>
           <w:lang w:eastAsia="fr-FR"/>
         </w:rPr>
-        <w:t>en ligne</w:t>
-      </w:r>
-      <w:r>
-        <w:rPr>
-          <w:rFonts w:ascii="Arial" w:eastAsia="Times New Roman" w:hAnsi="Arial" w:cs="Arial"/>
-          <w:lang w:eastAsia="fr-FR"/>
-        </w:rPr>
-        <w:t xml:space="preserve"> ou par messagerie.</w:t>
+        <w:t xml:space="preserve">L’indicateur </w:t>
+      </w:r>
+      <w:r>
+        <w:rPr>
+          <w:rFonts w:ascii="Arial" w:eastAsia="Times New Roman" w:hAnsi="Arial" w:cs="Arial"/>
+          <w:b/>
+          <w:bCs/>
+          <w:lang w:eastAsia="fr-FR"/>
+        </w:rPr>
+        <w:t>A1</w:t>
+      </w:r>
+      <w:r>
+        <w:rPr>
+          <w:rFonts w:ascii="Arial" w:eastAsia="Times New Roman" w:hAnsi="Arial" w:cs="Arial"/>
+          <w:lang w:eastAsia="fr-FR"/>
+        </w:rPr>
+        <w:t xml:space="preserve"> devra être documenté de manière exhaustive à partir des bases consolidées de formation.</w:t>
       </w:r>
     </w:p>
     <w:p>
@@ -925,7 +1351,88 @@
           <w:rFonts w:ascii="Arial" w:eastAsia="Times New Roman" w:hAnsi="Arial" w:cs="Arial"/>
           <w:lang w:eastAsia="fr-FR"/>
         </w:rPr>
-        <w:t>Au-delà de la simple compilation des listes, un travail de nettoyage sera indispensable. Il faudra notamment éliminer les doublons, harmoniser les noms de projets et de partenaires, vérifier les coordonnées, distinguer les inscrits des participants effectifs et repérer les cohortes pour lesquelles un suivi d’insertion à 6 mois ou 12 mois est déjà méthodologiquement possible.</w:t>
+        <w:t xml:space="preserve">Les indicateurs </w:t>
+      </w:r>
+      <w:r>
+        <w:rPr>
+          <w:rFonts w:ascii="Arial" w:eastAsia="Times New Roman" w:hAnsi="Arial" w:cs="Arial"/>
+          <w:b/>
+          <w:bCs/>
+          <w:lang w:eastAsia="fr-FR"/>
+        </w:rPr>
+        <w:t>A2</w:t>
+      </w:r>
+      <w:r>
+        <w:rPr>
+          <w:rFonts w:ascii="Arial" w:eastAsia="Times New Roman" w:hAnsi="Arial" w:cs="Arial"/>
+          <w:lang w:eastAsia="fr-FR"/>
+        </w:rPr>
+        <w:t xml:space="preserve"> et </w:t>
+      </w:r>
+      <w:r>
+        <w:rPr>
+          <w:rFonts w:ascii="Arial" w:eastAsia="Times New Roman" w:hAnsi="Arial" w:cs="Arial"/>
+          <w:b/>
+          <w:bCs/>
+          <w:lang w:eastAsia="fr-FR"/>
+        </w:rPr>
+        <w:t>A3</w:t>
+      </w:r>
+      <w:r>
+        <w:rPr>
+          <w:rFonts w:ascii="Arial" w:eastAsia="Times New Roman" w:hAnsi="Arial" w:cs="Arial"/>
+          <w:lang w:eastAsia="fr-FR"/>
+        </w:rPr>
+        <w:t xml:space="preserve"> pourront, dans la mesure du possible, être renseignés également de manière exhaustive, en mobilisant les données produites par les opérateurs de formation, les plateformes et les registres de certification.</w:t>
+      </w:r>
+    </w:p>
+    <w:p>
+      <w:pPr>
+        <w:spacing w:before="100" w:beforeAutospacing="1" w:after="100" w:afterAutospacing="1" w:line="240" w:lineRule="auto"/>
+        <w:jc w:val="both"/>
+        <w:rPr>
+          <w:rFonts w:ascii="Arial" w:eastAsia="Times New Roman" w:hAnsi="Arial" w:cs="Arial"/>
+          <w:lang w:eastAsia="fr-FR"/>
+        </w:rPr>
+      </w:pPr>
+      <w:r>
+        <w:rPr>
+          <w:rFonts w:ascii="Arial" w:eastAsia="Times New Roman" w:hAnsi="Arial" w:cs="Arial"/>
+          <w:lang w:eastAsia="fr-FR"/>
+        </w:rPr>
+        <w:t xml:space="preserve">Les indicateurs </w:t>
+      </w:r>
+      <w:r>
+        <w:rPr>
+          <w:rFonts w:ascii="Arial" w:eastAsia="Times New Roman" w:hAnsi="Arial" w:cs="Arial"/>
+          <w:b/>
+          <w:bCs/>
+          <w:lang w:eastAsia="fr-FR"/>
+        </w:rPr>
+        <w:t>A4</w:t>
+      </w:r>
+      <w:r>
+        <w:rPr>
+          <w:rFonts w:ascii="Arial" w:eastAsia="Times New Roman" w:hAnsi="Arial" w:cs="Arial"/>
+          <w:lang w:eastAsia="fr-FR"/>
+        </w:rPr>
+        <w:t xml:space="preserve"> et </w:t>
+      </w:r>
+      <w:r>
+        <w:rPr>
+          <w:rFonts w:ascii="Arial" w:eastAsia="Times New Roman" w:hAnsi="Arial" w:cs="Arial"/>
+          <w:b/>
+          <w:bCs/>
+          <w:lang w:eastAsia="fr-FR"/>
+        </w:rPr>
+        <w:t>A5</w:t>
+      </w:r>
+      <w:r>
+        <w:rPr>
+          <w:rFonts w:ascii="Arial" w:eastAsia="Times New Roman" w:hAnsi="Arial" w:cs="Arial"/>
+          <w:lang w:eastAsia="fr-FR"/>
+        </w:rPr>
+        <w:t>, en revanche, exigeront le plus souvent un travail d’enquête complémentaire. Le gain de compétences pourra être documenté soit à partir de données avant/après déjà disponibles, soit à travers une enquête courte sur la perception et l’usage des compétences acquises. L’insertion professionnelle à 6 ou 12 mois nécessitera un suivi spécifique auprès des bénéficiaires, avec une attention particulière portée à la définition de l’emploi, à la temporalité du suivi et au lien entre l’activité exercée et la formation suivie.</w:t>
       </w:r>
     </w:p>
     <w:p>
@@ -946,16 +1453,110 @@
           <w:bCs/>
           <w:lang w:eastAsia="fr-FR"/>
         </w:rPr>
-        <w:t>3</w:t>
-      </w:r>
-      <w:r>
-        <w:rPr>
-          <w:rFonts w:ascii="Arial" w:eastAsia="Times New Roman" w:hAnsi="Arial" w:cs="Arial"/>
-          <w:b/>
-          <w:bCs/>
-          <w:lang w:eastAsia="fr-FR"/>
-        </w:rPr>
-        <w:t>.2. Base de sondage issue de B1 : les activités économiques appuyées</w:t>
+        <w:t>5</w:t>
+      </w:r>
+      <w:r>
+        <w:rPr>
+          <w:rFonts w:ascii="Arial" w:eastAsia="Times New Roman" w:hAnsi="Arial" w:cs="Arial"/>
+          <w:b/>
+          <w:bCs/>
+          <w:lang w:eastAsia="fr-FR"/>
+        </w:rPr>
+        <w:t>.2. Indicateurs de la catégorie B</w:t>
+      </w:r>
+    </w:p>
+    <w:p>
+      <w:pPr>
+        <w:spacing w:before="100" w:beforeAutospacing="1" w:after="100" w:afterAutospacing="1" w:line="240" w:lineRule="auto"/>
+        <w:rPr>
+          <w:rFonts w:ascii="Arial" w:eastAsia="Times New Roman" w:hAnsi="Arial" w:cs="Arial"/>
+          <w:lang w:eastAsia="fr-FR"/>
+        </w:rPr>
+      </w:pPr>
+      <w:r>
+        <w:rPr>
+          <w:rFonts w:ascii="Arial" w:eastAsia="Times New Roman" w:hAnsi="Arial" w:cs="Arial"/>
+          <w:lang w:eastAsia="fr-FR"/>
+        </w:rPr>
+        <w:t>Les indicateurs B1 à B4 portent sur les structures soutenues et sur les effets économiques associés.</w:t>
+      </w:r>
+      <w:r>
+        <w:rPr>
+          <w:rFonts w:ascii="Arial" w:eastAsia="Times New Roman" w:hAnsi="Arial" w:cs="Arial"/>
+          <w:lang w:eastAsia="fr-FR"/>
+        </w:rPr>
+        <w:t xml:space="preserve"> </w:t>
+      </w:r>
+      <w:r>
+        <w:rPr>
+          <w:rFonts w:ascii="Arial" w:eastAsia="Times New Roman" w:hAnsi="Arial" w:cs="Arial"/>
+          <w:lang w:eastAsia="fr-FR"/>
+        </w:rPr>
+        <w:t xml:space="preserve">L’indicateur </w:t>
+      </w:r>
+      <w:r>
+        <w:rPr>
+          <w:rFonts w:ascii="Arial" w:eastAsia="Times New Roman" w:hAnsi="Arial" w:cs="Arial"/>
+          <w:b/>
+          <w:bCs/>
+          <w:lang w:eastAsia="fr-FR"/>
+        </w:rPr>
+        <w:t>B1</w:t>
+      </w:r>
+      <w:r>
+        <w:rPr>
+          <w:rFonts w:ascii="Arial" w:eastAsia="Times New Roman" w:hAnsi="Arial" w:cs="Arial"/>
+          <w:lang w:eastAsia="fr-FR"/>
+        </w:rPr>
+        <w:t xml:space="preserve"> devra être renseigné de manière exhaustive à partir des bases de suivi des projets.</w:t>
+      </w:r>
+    </w:p>
+    <w:p>
+      <w:pPr>
+        <w:spacing w:before="100" w:beforeAutospacing="1" w:after="100" w:afterAutospacing="1" w:line="240" w:lineRule="auto"/>
+        <w:rPr>
+          <w:rFonts w:ascii="Arial" w:eastAsia="Times New Roman" w:hAnsi="Arial" w:cs="Arial"/>
+          <w:lang w:eastAsia="fr-FR"/>
+        </w:rPr>
+      </w:pPr>
+      <w:r>
+        <w:rPr>
+          <w:rFonts w:ascii="Arial" w:eastAsia="Times New Roman" w:hAnsi="Arial" w:cs="Arial"/>
+          <w:lang w:eastAsia="fr-FR"/>
+        </w:rPr>
+        <w:t xml:space="preserve">Les indicateurs </w:t>
+      </w:r>
+      <w:r>
+        <w:rPr>
+          <w:rFonts w:ascii="Arial" w:eastAsia="Times New Roman" w:hAnsi="Arial" w:cs="Arial"/>
+          <w:b/>
+          <w:bCs/>
+          <w:lang w:eastAsia="fr-FR"/>
+        </w:rPr>
+        <w:t>B2</w:t>
+      </w:r>
+      <w:r>
+        <w:rPr>
+          <w:rFonts w:ascii="Arial" w:eastAsia="Times New Roman" w:hAnsi="Arial" w:cs="Arial"/>
+          <w:lang w:eastAsia="fr-FR"/>
+        </w:rPr>
+        <w:t xml:space="preserve"> et </w:t>
+      </w:r>
+      <w:r>
+        <w:rPr>
+          <w:rFonts w:ascii="Arial" w:eastAsia="Times New Roman" w:hAnsi="Arial" w:cs="Arial"/>
+          <w:b/>
+          <w:bCs/>
+          <w:lang w:eastAsia="fr-FR"/>
+        </w:rPr>
+        <w:t>B3</w:t>
+      </w:r>
+      <w:r>
+        <w:rPr>
+          <w:rFonts w:ascii="Arial" w:eastAsia="Times New Roman" w:hAnsi="Arial" w:cs="Arial"/>
+          <w:lang w:eastAsia="fr-FR"/>
+        </w:rPr>
+        <w:t xml:space="preserve"> devront être documentés par une enquête de suivi auprès des structures appuyées, permettant d’apprécier leur situation actuelle, la continuité de leur activité et les effets de l’appui sur l’emploi.</w:t>
       </w:r>
     </w:p>
     <w:p>
@@ -972,53 +1573,83 @@
           <w:rFonts w:ascii="Arial" w:eastAsia="Times New Roman" w:hAnsi="Arial" w:cs="Arial"/>
           <w:lang w:eastAsia="fr-FR"/>
         </w:rPr>
-        <w:t>La base construite à partir de l’indicateur B1 doit recenser l’ensemble des activités économiques appuyées par l’OIF, qu’il s’agisse d’AGR, de micro-entreprises, de coopératives, de très petites structures ou d’autres initiatives à potentiel économique. Elle constitue l’univers de référence pour le suivi des indicateurs de la catégorie B.</w:t>
-      </w:r>
-    </w:p>
-    <w:p>
-      <w:pPr>
-        <w:spacing w:before="100" w:beforeAutospacing="1" w:after="100" w:afterAutospacing="1" w:line="240" w:lineRule="auto"/>
-        <w:rPr>
-          <w:rFonts w:ascii="Arial" w:eastAsia="Times New Roman" w:hAnsi="Arial" w:cs="Arial"/>
-          <w:lang w:eastAsia="fr-FR"/>
-        </w:rPr>
-      </w:pPr>
-      <w:r>
-        <w:rPr>
-          <w:rFonts w:ascii="Arial" w:eastAsia="Times New Roman" w:hAnsi="Arial" w:cs="Arial"/>
-          <w:lang w:eastAsia="fr-FR"/>
-        </w:rPr>
-        <w:t>Cette base devra être alimentée à partir des PAS, des conventions, des rapports financiers, des fichiers de suivi des projets et des informations détenues par les partenaires de mise en œuvre. Elle devra, elle aussi, être harmonisée et nettoyée.</w:t>
-      </w:r>
-    </w:p>
-    <w:p>
-      <w:pPr>
-        <w:spacing w:before="100" w:beforeAutospacing="1" w:after="100" w:afterAutospacing="1" w:line="240" w:lineRule="auto"/>
-        <w:rPr>
-          <w:rFonts w:ascii="Arial" w:eastAsia="Times New Roman" w:hAnsi="Arial" w:cs="Arial"/>
-          <w:lang w:eastAsia="fr-FR"/>
-        </w:rPr>
-      </w:pPr>
-      <w:r>
-        <w:rPr>
-          <w:rFonts w:ascii="Arial" w:eastAsia="Times New Roman" w:hAnsi="Arial" w:cs="Arial"/>
-          <w:lang w:eastAsia="fr-FR"/>
-        </w:rPr>
-        <w:t>Pour chaque structure, il conviendra de renseigner un identifiant, le nom de la structure ou du porteur, le sexe et, si possible, l’âge du porteur principal, le pays et la localité, le secteur d’activité, la date de création, la date de l’appui, la nature et le montant de l’appui, ainsi que les coordonnées permettant le suivi</w:t>
-      </w:r>
-      <w:r>
-        <w:rPr>
-          <w:rFonts w:ascii="Arial" w:eastAsia="Times New Roman" w:hAnsi="Arial" w:cs="Arial"/>
-          <w:lang w:eastAsia="fr-FR"/>
-        </w:rPr>
-        <w:t xml:space="preserve"> à distance</w:t>
-      </w:r>
-      <w:r>
-        <w:rPr>
-          <w:rFonts w:ascii="Arial" w:eastAsia="Times New Roman" w:hAnsi="Arial" w:cs="Arial"/>
-          <w:lang w:eastAsia="fr-FR"/>
-        </w:rPr>
-        <w:t>.</w:t>
+        <w:t xml:space="preserve">L’indicateur </w:t>
+      </w:r>
+      <w:r>
+        <w:rPr>
+          <w:rFonts w:ascii="Arial" w:eastAsia="Times New Roman" w:hAnsi="Arial" w:cs="Arial"/>
+          <w:b/>
+          <w:bCs/>
+          <w:lang w:eastAsia="fr-FR"/>
+        </w:rPr>
+        <w:t>B4</w:t>
+      </w:r>
+      <w:r>
+        <w:rPr>
+          <w:rFonts w:ascii="Arial" w:eastAsia="Times New Roman" w:hAnsi="Arial" w:cs="Arial"/>
+          <w:lang w:eastAsia="fr-FR"/>
+        </w:rPr>
+        <w:t>, relatif aux emplois indirects</w:t>
+      </w:r>
+      <w:r>
+        <w:rPr>
+          <w:rFonts w:ascii="Arial" w:eastAsia="Times New Roman" w:hAnsi="Arial" w:cs="Arial"/>
+          <w:lang w:eastAsia="fr-FR"/>
+        </w:rPr>
+        <w:t xml:space="preserve">, </w:t>
+      </w:r>
+      <w:r>
+        <w:rPr>
+          <w:rFonts w:ascii="Arial" w:eastAsia="Times New Roman" w:hAnsi="Arial" w:cs="Arial"/>
+          <w:lang w:eastAsia="fr-FR"/>
+        </w:rPr>
+        <w:t>ne pourra pas, dans la plupart des cas, être mesuré directement sur l’ensemble des structures. Sa documentation devra reposer sur des hypothèses explicites, des analyses sectorielles, des études de cas ou un sous-échantillon de situations bien documentées.</w:t>
+      </w:r>
+    </w:p>
+    <w:p>
+      <w:pPr>
+        <w:spacing w:before="100" w:beforeAutospacing="1" w:after="100" w:afterAutospacing="1" w:line="240" w:lineRule="auto"/>
+        <w:outlineLvl w:val="2"/>
+        <w:rPr>
+          <w:rFonts w:ascii="Arial" w:eastAsia="Times New Roman" w:hAnsi="Arial" w:cs="Arial"/>
+          <w:b/>
+          <w:bCs/>
+          <w:lang w:eastAsia="fr-FR"/>
+        </w:rPr>
+      </w:pPr>
+      <w:r>
+        <w:rPr>
+          <w:rFonts w:ascii="Arial" w:eastAsia="Times New Roman" w:hAnsi="Arial" w:cs="Arial"/>
+          <w:b/>
+          <w:bCs/>
+          <w:lang w:eastAsia="fr-FR"/>
+        </w:rPr>
+        <w:t>5</w:t>
+      </w:r>
+      <w:r>
+        <w:rPr>
+          <w:rFonts w:ascii="Arial" w:eastAsia="Times New Roman" w:hAnsi="Arial" w:cs="Arial"/>
+          <w:b/>
+          <w:bCs/>
+          <w:lang w:eastAsia="fr-FR"/>
+        </w:rPr>
+        <w:t>.3. Indicateurs de la catégorie C</w:t>
+      </w:r>
+    </w:p>
+    <w:p>
+      <w:pPr>
+        <w:spacing w:before="100" w:beforeAutospacing="1" w:after="100" w:afterAutospacing="1" w:line="240" w:lineRule="auto"/>
+        <w:rPr>
+          <w:rFonts w:ascii="Arial" w:eastAsia="Times New Roman" w:hAnsi="Arial" w:cs="Arial"/>
+          <w:lang w:eastAsia="fr-FR"/>
+        </w:rPr>
+      </w:pPr>
+      <w:r>
+        <w:rPr>
+          <w:rFonts w:ascii="Arial" w:eastAsia="Times New Roman" w:hAnsi="Arial" w:cs="Arial"/>
+          <w:lang w:eastAsia="fr-FR"/>
+        </w:rPr>
+        <w:t>Les indicateurs de la catégorie C portent sur l’intermédiation et l’accès aux opportunités. Ils supposent, dans la plupart des cas, l’existence d’une trace ou d’un registre permettant de suivre les mises en relation et leurs suites.</w:t>
       </w:r>
     </w:p>
     <w:p>
@@ -1035,53 +1666,23 @@
           <w:rFonts w:ascii="Arial" w:eastAsia="Times New Roman" w:hAnsi="Arial" w:cs="Arial"/>
           <w:lang w:eastAsia="fr-FR"/>
         </w:rPr>
-        <w:t>Le nettoyage de cette base devra permettre de distinguer clairement les structures nouvellement créées des structures préexistantes renforcées, d’éviter les doubles comptes liés à plusieurs appuis accordés à une même structure et de fiabiliser les informations de contact.</w:t>
-      </w:r>
-    </w:p>
-    <w:p>
-      <w:pPr>
-        <w:spacing w:before="100" w:beforeAutospacing="1" w:after="100" w:afterAutospacing="1" w:line="240" w:lineRule="auto"/>
-        <w:outlineLvl w:val="1"/>
-        <w:rPr>
-          <w:rFonts w:ascii="Arial" w:eastAsia="Times New Roman" w:hAnsi="Arial" w:cs="Arial"/>
-          <w:b/>
-          <w:bCs/>
-          <w:lang w:eastAsia="fr-FR"/>
-        </w:rPr>
-      </w:pPr>
-      <w:r>
-        <w:rPr>
-          <w:rFonts w:ascii="Arial" w:eastAsia="Times New Roman" w:hAnsi="Arial" w:cs="Arial"/>
-          <w:b/>
-          <w:bCs/>
-          <w:lang w:eastAsia="fr-FR"/>
-        </w:rPr>
-        <w:t>4</w:t>
-      </w:r>
-      <w:r>
-        <w:rPr>
-          <w:rFonts w:ascii="Arial" w:eastAsia="Times New Roman" w:hAnsi="Arial" w:cs="Arial"/>
-          <w:b/>
-          <w:bCs/>
-          <w:lang w:eastAsia="fr-FR"/>
-        </w:rPr>
-        <w:t>. Utilisation des bases de sondage pour la documentation des autres indicateurs</w:t>
-      </w:r>
-    </w:p>
-    <w:p>
-      <w:pPr>
-        <w:spacing w:before="100" w:beforeAutospacing="1" w:after="100" w:afterAutospacing="1" w:line="240" w:lineRule="auto"/>
-        <w:rPr>
-          <w:rFonts w:ascii="Arial" w:eastAsia="Times New Roman" w:hAnsi="Arial" w:cs="Arial"/>
-          <w:lang w:eastAsia="fr-FR"/>
-        </w:rPr>
-      </w:pPr>
-      <w:r>
-        <w:rPr>
-          <w:rFonts w:ascii="Arial" w:eastAsia="Times New Roman" w:hAnsi="Arial" w:cs="Arial"/>
-          <w:lang w:eastAsia="fr-FR"/>
-        </w:rPr>
-        <w:t>Une fois les bases A1 et B1 constituées, elles pourront être mobilisées comme socle pour le renseignement des autres indicateurs.</w:t>
+        <w:t xml:space="preserve">L’indicateur </w:t>
+      </w:r>
+      <w:r>
+        <w:rPr>
+          <w:rFonts w:ascii="Arial" w:eastAsia="Times New Roman" w:hAnsi="Arial" w:cs="Arial"/>
+          <w:b/>
+          <w:bCs/>
+          <w:lang w:eastAsia="fr-FR"/>
+        </w:rPr>
+        <w:t>C1</w:t>
+      </w:r>
+      <w:r>
+        <w:rPr>
+          <w:rFonts w:ascii="Arial" w:eastAsia="Times New Roman" w:hAnsi="Arial" w:cs="Arial"/>
+          <w:lang w:eastAsia="fr-FR"/>
+        </w:rPr>
+        <w:t xml:space="preserve"> pourra être renseigné à partir des bases de plateformes, des registres d’événements, des outils de suivi des partenaires ou de tout dispositif permettant d’identifier les mises en relation documentées.</w:t>
       </w:r>
     </w:p>
     <w:p>
@@ -1098,23 +1699,63 @@
           <w:rFonts w:ascii="Arial" w:eastAsia="Times New Roman" w:hAnsi="Arial" w:cs="Arial"/>
           <w:lang w:eastAsia="fr-FR"/>
         </w:rPr>
-        <w:t xml:space="preserve">La base des </w:t>
-      </w:r>
-      <w:r>
-        <w:rPr>
-          <w:rFonts w:ascii="Arial" w:eastAsia="Times New Roman" w:hAnsi="Arial" w:cs="Arial"/>
-          <w:b/>
-          <w:bCs/>
-          <w:lang w:eastAsia="fr-FR"/>
-        </w:rPr>
-        <w:t>jeunes formés</w:t>
-      </w:r>
-      <w:r>
-        <w:rPr>
-          <w:rFonts w:ascii="Arial" w:eastAsia="Times New Roman" w:hAnsi="Arial" w:cs="Arial"/>
-          <w:lang w:eastAsia="fr-FR"/>
-        </w:rPr>
-        <w:t xml:space="preserve"> permettra de documenter les indicateurs relatifs à l’achèvement des formations, à la certification, au gain de compétences, à l’insertion professionnelle, à l’utilité perçue de l’appui et, le cas échéant, à l’apport du français à l’employabilité. Elle servira donc à la fois à des calculs exhaustifs lorsque les données existent déjà dans les dispositifs de formation, et à des enquêtes ciblées lorsque l’information n’est pas disponible dans les sources administratives.</w:t>
+        <w:t xml:space="preserve">Les indicateurs </w:t>
+      </w:r>
+      <w:r>
+        <w:rPr>
+          <w:rFonts w:ascii="Arial" w:eastAsia="Times New Roman" w:hAnsi="Arial" w:cs="Arial"/>
+          <w:b/>
+          <w:bCs/>
+          <w:lang w:eastAsia="fr-FR"/>
+        </w:rPr>
+        <w:t>C2</w:t>
+      </w:r>
+      <w:r>
+        <w:rPr>
+          <w:rFonts w:ascii="Arial" w:eastAsia="Times New Roman" w:hAnsi="Arial" w:cs="Arial"/>
+          <w:lang w:eastAsia="fr-FR"/>
+        </w:rPr>
+        <w:t xml:space="preserve">, </w:t>
+      </w:r>
+      <w:r>
+        <w:rPr>
+          <w:rFonts w:ascii="Arial" w:eastAsia="Times New Roman" w:hAnsi="Arial" w:cs="Arial"/>
+          <w:b/>
+          <w:bCs/>
+          <w:lang w:eastAsia="fr-FR"/>
+        </w:rPr>
+        <w:t>C3</w:t>
+      </w:r>
+      <w:r>
+        <w:rPr>
+          <w:rFonts w:ascii="Arial" w:eastAsia="Times New Roman" w:hAnsi="Arial" w:cs="Arial"/>
+          <w:lang w:eastAsia="fr-FR"/>
+        </w:rPr>
+        <w:t xml:space="preserve"> et </w:t>
+      </w:r>
+      <w:r>
+        <w:rPr>
+          <w:rFonts w:ascii="Arial" w:eastAsia="Times New Roman" w:hAnsi="Arial" w:cs="Arial"/>
+          <w:b/>
+          <w:bCs/>
+          <w:lang w:eastAsia="fr-FR"/>
+        </w:rPr>
+        <w:t>C4</w:t>
+      </w:r>
+      <w:r>
+        <w:rPr>
+          <w:rFonts w:ascii="Arial" w:eastAsia="Times New Roman" w:hAnsi="Arial" w:cs="Arial"/>
+          <w:lang w:eastAsia="fr-FR"/>
+        </w:rPr>
+        <w:t xml:space="preserve"> nécessiteront un travail de suivi plus fin, visant à documenter la conversion des mises en relation en opportunités, la nature des opportunités effectivement </w:t>
+      </w:r>
+      <w:r>
+        <w:rPr>
+          <w:rFonts w:ascii="Arial" w:eastAsia="Times New Roman" w:hAnsi="Arial" w:cs="Arial"/>
+          <w:lang w:eastAsia="fr-FR"/>
+        </w:rPr>
+        <w:lastRenderedPageBreak/>
+        <w:t>obtenues et les délais d’accès. Cela supposera souvent des relances ciblées, voire un mini-questionnaire administré aux bénéficiaires concernés.</w:t>
       </w:r>
     </w:p>
     <w:p>
@@ -1131,594 +1772,6 @@
           <w:rFonts w:ascii="Arial" w:eastAsia="Times New Roman" w:hAnsi="Arial" w:cs="Arial"/>
           <w:lang w:eastAsia="fr-FR"/>
         </w:rPr>
-        <w:t xml:space="preserve">La base des </w:t>
-      </w:r>
-      <w:r>
-        <w:rPr>
-          <w:rFonts w:ascii="Arial" w:eastAsia="Times New Roman" w:hAnsi="Arial" w:cs="Arial"/>
-          <w:b/>
-          <w:bCs/>
-          <w:lang w:eastAsia="fr-FR"/>
-        </w:rPr>
-        <w:t>activités économiques appuyées</w:t>
-      </w:r>
-      <w:r>
-        <w:rPr>
-          <w:rFonts w:ascii="Arial" w:eastAsia="Times New Roman" w:hAnsi="Arial" w:cs="Arial"/>
-          <w:lang w:eastAsia="fr-FR"/>
-        </w:rPr>
-        <w:t xml:space="preserve"> permettra, quant à elle, de documenter les indicateurs relatifs à la survie des structures, aux emplois créés ou maintenus, et à certains effets économiques indirects, à partir d’enquêtes de suivi ou de modules spécifiques adressés aux porteurs d’activités.</w:t>
-      </w:r>
-    </w:p>
-    <w:p>
-      <w:pPr>
-        <w:spacing w:before="100" w:beforeAutospacing="1" w:after="100" w:afterAutospacing="1" w:line="240" w:lineRule="auto"/>
-        <w:jc w:val="both"/>
-        <w:rPr>
-          <w:rFonts w:ascii="Arial" w:eastAsia="Times New Roman" w:hAnsi="Arial" w:cs="Arial"/>
-          <w:lang w:eastAsia="fr-FR"/>
-        </w:rPr>
-      </w:pPr>
-      <w:r>
-        <w:rPr>
-          <w:rFonts w:ascii="Arial" w:eastAsia="Times New Roman" w:hAnsi="Arial" w:cs="Arial"/>
-          <w:lang w:eastAsia="fr-FR"/>
-        </w:rPr>
-        <w:lastRenderedPageBreak/>
-        <w:t xml:space="preserve">Ainsi, la base de sondage n’est pas seulement un instrument technique permettant de sélectionner des unités d’enquête. Elle constitue le </w:t>
-      </w:r>
-      <w:r>
-        <w:rPr>
-          <w:rFonts w:ascii="Arial" w:eastAsia="Times New Roman" w:hAnsi="Arial" w:cs="Arial"/>
-          <w:b/>
-          <w:bCs/>
-          <w:lang w:eastAsia="fr-FR"/>
-        </w:rPr>
-        <w:t>pivot méthodologique</w:t>
-      </w:r>
-      <w:r>
-        <w:rPr>
-          <w:rFonts w:ascii="Arial" w:eastAsia="Times New Roman" w:hAnsi="Arial" w:cs="Arial"/>
-          <w:lang w:eastAsia="fr-FR"/>
-        </w:rPr>
-        <w:t xml:space="preserve"> de l’ensemble du dispositif de documentation.</w:t>
-      </w:r>
-    </w:p>
-    <w:p>
-      <w:pPr>
-        <w:spacing w:before="100" w:beforeAutospacing="1" w:after="100" w:afterAutospacing="1" w:line="240" w:lineRule="auto"/>
-        <w:outlineLvl w:val="1"/>
-        <w:rPr>
-          <w:rFonts w:ascii="Arial" w:eastAsia="Times New Roman" w:hAnsi="Arial" w:cs="Arial"/>
-          <w:b/>
-          <w:bCs/>
-          <w:lang w:eastAsia="fr-FR"/>
-        </w:rPr>
-      </w:pPr>
-      <w:r>
-        <w:rPr>
-          <w:rFonts w:ascii="Arial" w:eastAsia="Times New Roman" w:hAnsi="Arial" w:cs="Arial"/>
-          <w:b/>
-          <w:bCs/>
-          <w:lang w:eastAsia="fr-FR"/>
-        </w:rPr>
-        <w:t>5</w:t>
-      </w:r>
-      <w:r>
-        <w:rPr>
-          <w:rFonts w:ascii="Arial" w:eastAsia="Times New Roman" w:hAnsi="Arial" w:cs="Arial"/>
-          <w:b/>
-          <w:bCs/>
-          <w:lang w:eastAsia="fr-FR"/>
-        </w:rPr>
-        <w:t>. Modalités de documentation par catégorie d’indicateurs</w:t>
-      </w:r>
-    </w:p>
-    <w:p>
-      <w:pPr>
-        <w:spacing w:before="100" w:beforeAutospacing="1" w:after="100" w:afterAutospacing="1" w:line="240" w:lineRule="auto"/>
-        <w:outlineLvl w:val="2"/>
-        <w:rPr>
-          <w:rFonts w:ascii="Arial" w:eastAsia="Times New Roman" w:hAnsi="Arial" w:cs="Arial"/>
-          <w:b/>
-          <w:bCs/>
-          <w:lang w:eastAsia="fr-FR"/>
-        </w:rPr>
-      </w:pPr>
-      <w:r>
-        <w:rPr>
-          <w:rFonts w:ascii="Arial" w:eastAsia="Times New Roman" w:hAnsi="Arial" w:cs="Arial"/>
-          <w:b/>
-          <w:bCs/>
-          <w:lang w:eastAsia="fr-FR"/>
-        </w:rPr>
-        <w:t>5</w:t>
-      </w:r>
-      <w:r>
-        <w:rPr>
-          <w:rFonts w:ascii="Arial" w:eastAsia="Times New Roman" w:hAnsi="Arial" w:cs="Arial"/>
-          <w:b/>
-          <w:bCs/>
-          <w:lang w:eastAsia="fr-FR"/>
-        </w:rPr>
-        <w:t>.1. Indicateurs de la catégorie A</w:t>
-      </w:r>
-    </w:p>
-    <w:p>
-      <w:pPr>
-        <w:spacing w:before="100" w:beforeAutospacing="1" w:after="100" w:afterAutospacing="1" w:line="240" w:lineRule="auto"/>
-        <w:jc w:val="both"/>
-        <w:rPr>
-          <w:rFonts w:ascii="Arial" w:eastAsia="Times New Roman" w:hAnsi="Arial" w:cs="Arial"/>
-          <w:lang w:eastAsia="fr-FR"/>
-        </w:rPr>
-      </w:pPr>
-      <w:r>
-        <w:rPr>
-          <w:rFonts w:ascii="Arial" w:eastAsia="Times New Roman" w:hAnsi="Arial" w:cs="Arial"/>
-          <w:lang w:eastAsia="fr-FR"/>
-        </w:rPr>
-        <w:t>Les indicateurs A1 à A5 relèvent d’une logique de suivi des parcours individuels. Tous ne demandent pas le même effort méthodologique.</w:t>
-      </w:r>
-      <w:r>
-        <w:rPr>
-          <w:rFonts w:ascii="Arial" w:eastAsia="Times New Roman" w:hAnsi="Arial" w:cs="Arial"/>
-          <w:lang w:eastAsia="fr-FR"/>
-        </w:rPr>
-        <w:t xml:space="preserve"> </w:t>
-      </w:r>
-      <w:r>
-        <w:rPr>
-          <w:rFonts w:ascii="Arial" w:eastAsia="Times New Roman" w:hAnsi="Arial" w:cs="Arial"/>
-          <w:lang w:eastAsia="fr-FR"/>
-        </w:rPr>
-        <w:t xml:space="preserve">L’indicateur </w:t>
-      </w:r>
-      <w:r>
-        <w:rPr>
-          <w:rFonts w:ascii="Arial" w:eastAsia="Times New Roman" w:hAnsi="Arial" w:cs="Arial"/>
-          <w:b/>
-          <w:bCs/>
-          <w:lang w:eastAsia="fr-FR"/>
-        </w:rPr>
-        <w:t>A1</w:t>
-      </w:r>
-      <w:r>
-        <w:rPr>
-          <w:rFonts w:ascii="Arial" w:eastAsia="Times New Roman" w:hAnsi="Arial" w:cs="Arial"/>
-          <w:lang w:eastAsia="fr-FR"/>
-        </w:rPr>
-        <w:t xml:space="preserve"> devra être documenté de manière exhaustive à partir des bases consolidées de formation.</w:t>
-      </w:r>
-    </w:p>
-    <w:p>
-      <w:pPr>
-        <w:spacing w:before="100" w:beforeAutospacing="1" w:after="100" w:afterAutospacing="1" w:line="240" w:lineRule="auto"/>
-        <w:jc w:val="both"/>
-        <w:rPr>
-          <w:rFonts w:ascii="Arial" w:eastAsia="Times New Roman" w:hAnsi="Arial" w:cs="Arial"/>
-          <w:lang w:eastAsia="fr-FR"/>
-        </w:rPr>
-      </w:pPr>
-      <w:r>
-        <w:rPr>
-          <w:rFonts w:ascii="Arial" w:eastAsia="Times New Roman" w:hAnsi="Arial" w:cs="Arial"/>
-          <w:lang w:eastAsia="fr-FR"/>
-        </w:rPr>
-        <w:t xml:space="preserve">Les indicateurs </w:t>
-      </w:r>
-      <w:r>
-        <w:rPr>
-          <w:rFonts w:ascii="Arial" w:eastAsia="Times New Roman" w:hAnsi="Arial" w:cs="Arial"/>
-          <w:b/>
-          <w:bCs/>
-          <w:lang w:eastAsia="fr-FR"/>
-        </w:rPr>
-        <w:t>A2</w:t>
-      </w:r>
-      <w:r>
-        <w:rPr>
-          <w:rFonts w:ascii="Arial" w:eastAsia="Times New Roman" w:hAnsi="Arial" w:cs="Arial"/>
-          <w:lang w:eastAsia="fr-FR"/>
-        </w:rPr>
-        <w:t xml:space="preserve"> et </w:t>
-      </w:r>
-      <w:r>
-        <w:rPr>
-          <w:rFonts w:ascii="Arial" w:eastAsia="Times New Roman" w:hAnsi="Arial" w:cs="Arial"/>
-          <w:b/>
-          <w:bCs/>
-          <w:lang w:eastAsia="fr-FR"/>
-        </w:rPr>
-        <w:t>A3</w:t>
-      </w:r>
-      <w:r>
-        <w:rPr>
-          <w:rFonts w:ascii="Arial" w:eastAsia="Times New Roman" w:hAnsi="Arial" w:cs="Arial"/>
-          <w:lang w:eastAsia="fr-FR"/>
-        </w:rPr>
-        <w:t xml:space="preserve"> pourront, dans la mesure du possible, être renseignés également de manière exhaustive, en mobilisant les données produites par les opérateurs de formation, les plateformes et les registres de certification.</w:t>
-      </w:r>
-    </w:p>
-    <w:p>
-      <w:pPr>
-        <w:spacing w:before="100" w:beforeAutospacing="1" w:after="100" w:afterAutospacing="1" w:line="240" w:lineRule="auto"/>
-        <w:jc w:val="both"/>
-        <w:rPr>
-          <w:rFonts w:ascii="Arial" w:eastAsia="Times New Roman" w:hAnsi="Arial" w:cs="Arial"/>
-          <w:lang w:eastAsia="fr-FR"/>
-        </w:rPr>
-      </w:pPr>
-      <w:r>
-        <w:rPr>
-          <w:rFonts w:ascii="Arial" w:eastAsia="Times New Roman" w:hAnsi="Arial" w:cs="Arial"/>
-          <w:lang w:eastAsia="fr-FR"/>
-        </w:rPr>
-        <w:t xml:space="preserve">Les indicateurs </w:t>
-      </w:r>
-      <w:r>
-        <w:rPr>
-          <w:rFonts w:ascii="Arial" w:eastAsia="Times New Roman" w:hAnsi="Arial" w:cs="Arial"/>
-          <w:b/>
-          <w:bCs/>
-          <w:lang w:eastAsia="fr-FR"/>
-        </w:rPr>
-        <w:t>A4</w:t>
-      </w:r>
-      <w:r>
-        <w:rPr>
-          <w:rFonts w:ascii="Arial" w:eastAsia="Times New Roman" w:hAnsi="Arial" w:cs="Arial"/>
-          <w:lang w:eastAsia="fr-FR"/>
-        </w:rPr>
-        <w:t xml:space="preserve"> et </w:t>
-      </w:r>
-      <w:r>
-        <w:rPr>
-          <w:rFonts w:ascii="Arial" w:eastAsia="Times New Roman" w:hAnsi="Arial" w:cs="Arial"/>
-          <w:b/>
-          <w:bCs/>
-          <w:lang w:eastAsia="fr-FR"/>
-        </w:rPr>
-        <w:t>A5</w:t>
-      </w:r>
-      <w:r>
-        <w:rPr>
-          <w:rFonts w:ascii="Arial" w:eastAsia="Times New Roman" w:hAnsi="Arial" w:cs="Arial"/>
-          <w:lang w:eastAsia="fr-FR"/>
-        </w:rPr>
-        <w:t>, en revanche, exigeront le plus souvent un travail d’enquête complémentaire. Le gain de compétences pourra être documenté soit à partir de données avant/après déjà disponibles, soit à travers une enquête courte sur la perception et l’usage des compétences acquises. L’insertion professionnelle à 6 ou 12 mois nécessitera un suivi spécifique auprès des bénéficiaires, avec une attention particulière portée à la définition de l’emploi, à la temporalité du suivi et au lien entre l’activité exercée et la formation suivie.</w:t>
-      </w:r>
-    </w:p>
-    <w:p>
-      <w:pPr>
-        <w:spacing w:before="100" w:beforeAutospacing="1" w:after="100" w:afterAutospacing="1" w:line="240" w:lineRule="auto"/>
-        <w:outlineLvl w:val="2"/>
-        <w:rPr>
-          <w:rFonts w:ascii="Arial" w:eastAsia="Times New Roman" w:hAnsi="Arial" w:cs="Arial"/>
-          <w:b/>
-          <w:bCs/>
-          <w:lang w:eastAsia="fr-FR"/>
-        </w:rPr>
-      </w:pPr>
-      <w:r>
-        <w:rPr>
-          <w:rFonts w:ascii="Arial" w:eastAsia="Times New Roman" w:hAnsi="Arial" w:cs="Arial"/>
-          <w:b/>
-          <w:bCs/>
-          <w:lang w:eastAsia="fr-FR"/>
-        </w:rPr>
-        <w:t>5</w:t>
-      </w:r>
-      <w:r>
-        <w:rPr>
-          <w:rFonts w:ascii="Arial" w:eastAsia="Times New Roman" w:hAnsi="Arial" w:cs="Arial"/>
-          <w:b/>
-          <w:bCs/>
-          <w:lang w:eastAsia="fr-FR"/>
-        </w:rPr>
-        <w:t>.2. Indicateurs de la catégorie B</w:t>
-      </w:r>
-    </w:p>
-    <w:p>
-      <w:pPr>
-        <w:spacing w:before="100" w:beforeAutospacing="1" w:after="100" w:afterAutospacing="1" w:line="240" w:lineRule="auto"/>
-        <w:rPr>
-          <w:rFonts w:ascii="Arial" w:eastAsia="Times New Roman" w:hAnsi="Arial" w:cs="Arial"/>
-          <w:lang w:eastAsia="fr-FR"/>
-        </w:rPr>
-      </w:pPr>
-      <w:r>
-        <w:rPr>
-          <w:rFonts w:ascii="Arial" w:eastAsia="Times New Roman" w:hAnsi="Arial" w:cs="Arial"/>
-          <w:lang w:eastAsia="fr-FR"/>
-        </w:rPr>
-        <w:t>Les indicateurs B1 à B4 portent sur les structures soutenues et sur les effets économiques associés.</w:t>
-      </w:r>
-      <w:r>
-        <w:rPr>
-          <w:rFonts w:ascii="Arial" w:eastAsia="Times New Roman" w:hAnsi="Arial" w:cs="Arial"/>
-          <w:lang w:eastAsia="fr-FR"/>
-        </w:rPr>
-        <w:t xml:space="preserve"> </w:t>
-      </w:r>
-      <w:r>
-        <w:rPr>
-          <w:rFonts w:ascii="Arial" w:eastAsia="Times New Roman" w:hAnsi="Arial" w:cs="Arial"/>
-          <w:lang w:eastAsia="fr-FR"/>
-        </w:rPr>
-        <w:t xml:space="preserve">L’indicateur </w:t>
-      </w:r>
-      <w:r>
-        <w:rPr>
-          <w:rFonts w:ascii="Arial" w:eastAsia="Times New Roman" w:hAnsi="Arial" w:cs="Arial"/>
-          <w:b/>
-          <w:bCs/>
-          <w:lang w:eastAsia="fr-FR"/>
-        </w:rPr>
-        <w:t>B1</w:t>
-      </w:r>
-      <w:r>
-        <w:rPr>
-          <w:rFonts w:ascii="Arial" w:eastAsia="Times New Roman" w:hAnsi="Arial" w:cs="Arial"/>
-          <w:lang w:eastAsia="fr-FR"/>
-        </w:rPr>
-        <w:t xml:space="preserve"> devra être renseigné de manière exhaustive à partir des bases de suivi des projets.</w:t>
-      </w:r>
-    </w:p>
-    <w:p>
-      <w:pPr>
-        <w:spacing w:before="100" w:beforeAutospacing="1" w:after="100" w:afterAutospacing="1" w:line="240" w:lineRule="auto"/>
-        <w:rPr>
-          <w:rFonts w:ascii="Arial" w:eastAsia="Times New Roman" w:hAnsi="Arial" w:cs="Arial"/>
-          <w:lang w:eastAsia="fr-FR"/>
-        </w:rPr>
-      </w:pPr>
-      <w:r>
-        <w:rPr>
-          <w:rFonts w:ascii="Arial" w:eastAsia="Times New Roman" w:hAnsi="Arial" w:cs="Arial"/>
-          <w:lang w:eastAsia="fr-FR"/>
-        </w:rPr>
-        <w:t xml:space="preserve">Les indicateurs </w:t>
-      </w:r>
-      <w:r>
-        <w:rPr>
-          <w:rFonts w:ascii="Arial" w:eastAsia="Times New Roman" w:hAnsi="Arial" w:cs="Arial"/>
-          <w:b/>
-          <w:bCs/>
-          <w:lang w:eastAsia="fr-FR"/>
-        </w:rPr>
-        <w:t>B2</w:t>
-      </w:r>
-      <w:r>
-        <w:rPr>
-          <w:rFonts w:ascii="Arial" w:eastAsia="Times New Roman" w:hAnsi="Arial" w:cs="Arial"/>
-          <w:lang w:eastAsia="fr-FR"/>
-        </w:rPr>
-        <w:t xml:space="preserve"> et </w:t>
-      </w:r>
-      <w:r>
-        <w:rPr>
-          <w:rFonts w:ascii="Arial" w:eastAsia="Times New Roman" w:hAnsi="Arial" w:cs="Arial"/>
-          <w:b/>
-          <w:bCs/>
-          <w:lang w:eastAsia="fr-FR"/>
-        </w:rPr>
-        <w:t>B3</w:t>
-      </w:r>
-      <w:r>
-        <w:rPr>
-          <w:rFonts w:ascii="Arial" w:eastAsia="Times New Roman" w:hAnsi="Arial" w:cs="Arial"/>
-          <w:lang w:eastAsia="fr-FR"/>
-        </w:rPr>
-        <w:t xml:space="preserve"> devront être documentés par une enquête de suivi auprès des structures appuyées, permettant d’apprécier leur situation actuelle, la continuité de leur activité et les effets de l’appui sur l’emploi.</w:t>
-      </w:r>
-    </w:p>
-    <w:p>
-      <w:pPr>
-        <w:spacing w:before="100" w:beforeAutospacing="1" w:after="100" w:afterAutospacing="1" w:line="240" w:lineRule="auto"/>
-        <w:jc w:val="both"/>
-        <w:rPr>
-          <w:rFonts w:ascii="Arial" w:eastAsia="Times New Roman" w:hAnsi="Arial" w:cs="Arial"/>
-          <w:lang w:eastAsia="fr-FR"/>
-        </w:rPr>
-      </w:pPr>
-      <w:r>
-        <w:rPr>
-          <w:rFonts w:ascii="Arial" w:eastAsia="Times New Roman" w:hAnsi="Arial" w:cs="Arial"/>
-          <w:lang w:eastAsia="fr-FR"/>
-        </w:rPr>
-        <w:t xml:space="preserve">L’indicateur </w:t>
-      </w:r>
-      <w:r>
-        <w:rPr>
-          <w:rFonts w:ascii="Arial" w:eastAsia="Times New Roman" w:hAnsi="Arial" w:cs="Arial"/>
-          <w:b/>
-          <w:bCs/>
-          <w:lang w:eastAsia="fr-FR"/>
-        </w:rPr>
-        <w:t>B4</w:t>
-      </w:r>
-      <w:r>
-        <w:rPr>
-          <w:rFonts w:ascii="Arial" w:eastAsia="Times New Roman" w:hAnsi="Arial" w:cs="Arial"/>
-          <w:lang w:eastAsia="fr-FR"/>
-        </w:rPr>
-        <w:t>, relatif aux emplois indirects</w:t>
-      </w:r>
-      <w:r>
-        <w:rPr>
-          <w:rFonts w:ascii="Arial" w:eastAsia="Times New Roman" w:hAnsi="Arial" w:cs="Arial"/>
-          <w:lang w:eastAsia="fr-FR"/>
-        </w:rPr>
-        <w:t xml:space="preserve">, </w:t>
-      </w:r>
-      <w:r>
-        <w:rPr>
-          <w:rFonts w:ascii="Arial" w:eastAsia="Times New Roman" w:hAnsi="Arial" w:cs="Arial"/>
-          <w:lang w:eastAsia="fr-FR"/>
-        </w:rPr>
-        <w:t>ne pourra pas, dans la plupart des cas, être mesuré directement sur l’ensemble des structures. Sa documentation devra reposer sur des hypothèses explicites, des analyses sectorielles, des études de cas ou un sous-échantillon de situations bien documentées.</w:t>
-      </w:r>
-    </w:p>
-    <w:p>
-      <w:pPr>
-        <w:spacing w:before="100" w:beforeAutospacing="1" w:after="100" w:afterAutospacing="1" w:line="240" w:lineRule="auto"/>
-        <w:outlineLvl w:val="2"/>
-        <w:rPr>
-          <w:rFonts w:ascii="Arial" w:eastAsia="Times New Roman" w:hAnsi="Arial" w:cs="Arial"/>
-          <w:b/>
-          <w:bCs/>
-          <w:lang w:eastAsia="fr-FR"/>
-        </w:rPr>
-      </w:pPr>
-      <w:r>
-        <w:rPr>
-          <w:rFonts w:ascii="Arial" w:eastAsia="Times New Roman" w:hAnsi="Arial" w:cs="Arial"/>
-          <w:b/>
-          <w:bCs/>
-          <w:lang w:eastAsia="fr-FR"/>
-        </w:rPr>
-        <w:t>5</w:t>
-      </w:r>
-      <w:r>
-        <w:rPr>
-          <w:rFonts w:ascii="Arial" w:eastAsia="Times New Roman" w:hAnsi="Arial" w:cs="Arial"/>
-          <w:b/>
-          <w:bCs/>
-          <w:lang w:eastAsia="fr-FR"/>
-        </w:rPr>
-        <w:t>.3. Indicateurs de la catégorie C</w:t>
-      </w:r>
-    </w:p>
-    <w:p>
-      <w:pPr>
-        <w:spacing w:before="100" w:beforeAutospacing="1" w:after="100" w:afterAutospacing="1" w:line="240" w:lineRule="auto"/>
-        <w:rPr>
-          <w:rFonts w:ascii="Arial" w:eastAsia="Times New Roman" w:hAnsi="Arial" w:cs="Arial"/>
-          <w:lang w:eastAsia="fr-FR"/>
-        </w:rPr>
-      </w:pPr>
-      <w:r>
-        <w:rPr>
-          <w:rFonts w:ascii="Arial" w:eastAsia="Times New Roman" w:hAnsi="Arial" w:cs="Arial"/>
-          <w:lang w:eastAsia="fr-FR"/>
-        </w:rPr>
-        <w:t>Les indicateurs de la catégorie C portent sur l’intermédiation et l’accès aux opportunités. Ils supposent, dans la plupart des cas, l’existence d’une trace ou d’un registre permettant de suivre les mises en relation et leurs suites.</w:t>
-      </w:r>
-    </w:p>
-    <w:p>
-      <w:pPr>
-        <w:spacing w:before="100" w:beforeAutospacing="1" w:after="100" w:afterAutospacing="1" w:line="240" w:lineRule="auto"/>
-        <w:jc w:val="both"/>
-        <w:rPr>
-          <w:rFonts w:ascii="Arial" w:eastAsia="Times New Roman" w:hAnsi="Arial" w:cs="Arial"/>
-          <w:lang w:eastAsia="fr-FR"/>
-        </w:rPr>
-      </w:pPr>
-      <w:r>
-        <w:rPr>
-          <w:rFonts w:ascii="Arial" w:eastAsia="Times New Roman" w:hAnsi="Arial" w:cs="Arial"/>
-          <w:lang w:eastAsia="fr-FR"/>
-        </w:rPr>
-        <w:t xml:space="preserve">L’indicateur </w:t>
-      </w:r>
-      <w:r>
-        <w:rPr>
-          <w:rFonts w:ascii="Arial" w:eastAsia="Times New Roman" w:hAnsi="Arial" w:cs="Arial"/>
-          <w:b/>
-          <w:bCs/>
-          <w:lang w:eastAsia="fr-FR"/>
-        </w:rPr>
-        <w:t>C1</w:t>
-      </w:r>
-      <w:r>
-        <w:rPr>
-          <w:rFonts w:ascii="Arial" w:eastAsia="Times New Roman" w:hAnsi="Arial" w:cs="Arial"/>
-          <w:lang w:eastAsia="fr-FR"/>
-        </w:rPr>
-        <w:t xml:space="preserve"> pourra être renseigné à partir des bases de plateformes, des registres d’événements, des outils de suivi des partenaires ou de tout dispositif permettant d’identifier les mises en relation documentées.</w:t>
-      </w:r>
-    </w:p>
-    <w:p>
-      <w:pPr>
-        <w:spacing w:before="100" w:beforeAutospacing="1" w:after="100" w:afterAutospacing="1" w:line="240" w:lineRule="auto"/>
-        <w:jc w:val="both"/>
-        <w:rPr>
-          <w:rFonts w:ascii="Arial" w:eastAsia="Times New Roman" w:hAnsi="Arial" w:cs="Arial"/>
-          <w:lang w:eastAsia="fr-FR"/>
-        </w:rPr>
-      </w:pPr>
-      <w:r>
-        <w:rPr>
-          <w:rFonts w:ascii="Arial" w:eastAsia="Times New Roman" w:hAnsi="Arial" w:cs="Arial"/>
-          <w:lang w:eastAsia="fr-FR"/>
-        </w:rPr>
-        <w:t xml:space="preserve">Les indicateurs </w:t>
-      </w:r>
-      <w:r>
-        <w:rPr>
-          <w:rFonts w:ascii="Arial" w:eastAsia="Times New Roman" w:hAnsi="Arial" w:cs="Arial"/>
-          <w:b/>
-          <w:bCs/>
-          <w:lang w:eastAsia="fr-FR"/>
-        </w:rPr>
-        <w:t>C2</w:t>
-      </w:r>
-      <w:r>
-        <w:rPr>
-          <w:rFonts w:ascii="Arial" w:eastAsia="Times New Roman" w:hAnsi="Arial" w:cs="Arial"/>
-          <w:lang w:eastAsia="fr-FR"/>
-        </w:rPr>
-        <w:t xml:space="preserve">, </w:t>
-      </w:r>
-      <w:r>
-        <w:rPr>
-          <w:rFonts w:ascii="Arial" w:eastAsia="Times New Roman" w:hAnsi="Arial" w:cs="Arial"/>
-          <w:b/>
-          <w:bCs/>
-          <w:lang w:eastAsia="fr-FR"/>
-        </w:rPr>
-        <w:t>C3</w:t>
-      </w:r>
-      <w:r>
-        <w:rPr>
-          <w:rFonts w:ascii="Arial" w:eastAsia="Times New Roman" w:hAnsi="Arial" w:cs="Arial"/>
-          <w:lang w:eastAsia="fr-FR"/>
-        </w:rPr>
-        <w:t xml:space="preserve"> et </w:t>
-      </w:r>
-      <w:r>
-        <w:rPr>
-          <w:rFonts w:ascii="Arial" w:eastAsia="Times New Roman" w:hAnsi="Arial" w:cs="Arial"/>
-          <w:b/>
-          <w:bCs/>
-          <w:lang w:eastAsia="fr-FR"/>
-        </w:rPr>
-        <w:t>C4</w:t>
-      </w:r>
-      <w:r>
-        <w:rPr>
-          <w:rFonts w:ascii="Arial" w:eastAsia="Times New Roman" w:hAnsi="Arial" w:cs="Arial"/>
-          <w:lang w:eastAsia="fr-FR"/>
-        </w:rPr>
-        <w:t xml:space="preserve"> nécessiteront un travail de suivi plus fin, visant à documenter la conversion des mises en relation en opportunités, la nature des opportunités effectivement obtenues et les délais d’accès. Cela supposera souvent des relances ciblées, voire un mini-questionnaire administré aux bénéficiaires concernés.</w:t>
-      </w:r>
-    </w:p>
-    <w:p>
-      <w:pPr>
-        <w:spacing w:before="100" w:beforeAutospacing="1" w:after="100" w:afterAutospacing="1" w:line="240" w:lineRule="auto"/>
-        <w:jc w:val="both"/>
-        <w:rPr>
-          <w:rFonts w:ascii="Arial" w:eastAsia="Times New Roman" w:hAnsi="Arial" w:cs="Arial"/>
-          <w:lang w:eastAsia="fr-FR"/>
-        </w:rPr>
-      </w:pPr>
-      <w:r>
-        <w:rPr>
-          <w:rFonts w:ascii="Arial" w:eastAsia="Times New Roman" w:hAnsi="Arial" w:cs="Arial"/>
-          <w:lang w:eastAsia="fr-FR"/>
-        </w:rPr>
-        <w:lastRenderedPageBreak/>
         <w:t xml:space="preserve">L’indicateur </w:t>
       </w:r>
       <w:r>
@@ -2086,7 +2139,14 @@
         <w:rPr>
           <w:rFonts w:ascii="Arial" w:hAnsi="Arial" w:cs="Arial"/>
         </w:rPr>
-        <w:t>, à cheval sur la fin du mois d’avril et le début du mois de mai, portera sur la préparation méthodologique des outils. À ce stade, il conviendra de finaliser les questionnaires, d’arrêter les critères d’échantillonnage, de définir les modules transversaux, de structurer les tableaux de suivi documentaire et, le cas échéant, de tester les outils sur un nombre limité de cas afin d’en vérifier la pertinence, la lisibilité et la faisabilité.</w:t>
+        <w:t xml:space="preserve">, à cheval sur la fin du mois d’avril et le début du mois de mai, portera sur la préparation méthodologique des outils. À ce stade, il conviendra de finaliser les questionnaires, d’arrêter les critères d’échantillonnage, de définir les modules transversaux, de structurer les tableaux de suivi documentaire et, le cas </w:t>
+      </w:r>
+      <w:r>
+        <w:rPr>
+          <w:rFonts w:ascii="Arial" w:hAnsi="Arial" w:cs="Arial"/>
+        </w:rPr>
+        <w:lastRenderedPageBreak/>
+        <w:t>échéant, de tester les outils sur un nombre limité de cas afin d’en vérifier la pertinence, la lisibilité et la faisabilité.</w:t>
       </w:r>
     </w:p>
     <w:p>
@@ -2102,7 +2162,6 @@
           <w:rStyle w:val="lev"/>
           <w:rFonts w:ascii="Arial" w:hAnsi="Arial" w:cs="Arial"/>
         </w:rPr>
-        <w:lastRenderedPageBreak/>
         <w:t>La troisième séquence</w:t>
       </w:r>
       <w:r>
@@ -2131,19 +2190,7 @@
         <w:rPr>
           <w:rFonts w:ascii="Arial" w:hAnsi="Arial" w:cs="Arial"/>
         </w:rPr>
-        <w:t xml:space="preserve"> </w:t>
-      </w:r>
-      <w:r>
-        <w:rPr>
-          <w:rFonts w:ascii="Arial" w:hAnsi="Arial" w:cs="Arial"/>
-        </w:rPr>
-        <w:t xml:space="preserve">durant </w:t>
-      </w:r>
-      <w:r>
-        <w:rPr>
-          <w:rFonts w:ascii="Arial" w:hAnsi="Arial" w:cs="Arial"/>
-        </w:rPr>
-        <w:t>la première quinzaine de juin portera sur le traitement des données, le calcul des indicateurs et la documentation des résultats. Elle permettra de nettoyer les bases finales, de calculer les premiers résultats, de produire une synthèse intermédiaire et d’identifier les éventuelles lacunes nécessitant des compléments ultérieurs.</w:t>
+        <w:t xml:space="preserve"> durant la première quinzaine de juin portera sur le traitement des données, le calcul des indicateurs et la documentation des résultats. Elle permettra de nettoyer les bases finales, de calculer les premiers résultats, de produire une synthèse intermédiaire et d’identifier les éventuelles lacunes nécessitant des compléments ultérieurs.</w:t>
       </w:r>
     </w:p>
     <w:p>
@@ -2298,7 +2345,6 @@
                 <w:rFonts w:ascii="Arial" w:eastAsia="Times New Roman" w:hAnsi="Arial" w:cs="Arial"/>
                 <w:b/>
                 <w:bCs/>
-                <w:highlight w:val="yellow"/>
                 <w:lang w:eastAsia="fr-FR"/>
               </w:rPr>
             </w:pPr>
@@ -2307,7 +2353,6 @@
                 <w:rFonts w:ascii="Arial" w:eastAsia="Times New Roman" w:hAnsi="Arial" w:cs="Arial"/>
                 <w:b/>
                 <w:bCs/>
-                <w:highlight w:val="yellow"/>
                 <w:lang w:eastAsia="fr-FR"/>
               </w:rPr>
               <w:t>Phase 1</w:t>
@@ -2335,35 +2380,10 @@
                 <w:b/>
                 <w:bCs/>
                 <w:color w:val="000000"/>
-                <w:highlight w:val="yellow"/>
                 <w:bdr w:val="none" w:sz="0" w:space="0" w:color="auto" w:frame="1"/>
                 <w:lang w:eastAsia="fr-FR"/>
               </w:rPr>
-              <w:t>P</w:t>
-            </w:r>
-            <w:r>
-              <w:rPr>
-                <w:rFonts w:ascii="Arial" w:eastAsia="Times New Roman" w:hAnsi="Arial" w:cs="Arial"/>
-                <w:b/>
-                <w:bCs/>
-                <w:color w:val="000000"/>
-                <w:highlight w:val="yellow"/>
-                <w:bdr w:val="none" w:sz="0" w:space="0" w:color="auto" w:frame="1"/>
-                <w:lang w:eastAsia="fr-FR"/>
-              </w:rPr>
-              <w:t xml:space="preserve">remière consolidation </w:t>
-            </w:r>
-            <w:r>
-              <w:rPr>
-                <w:rFonts w:ascii="Arial" w:eastAsia="Times New Roman" w:hAnsi="Arial" w:cs="Arial"/>
-                <w:b/>
-                <w:bCs/>
-                <w:color w:val="000000"/>
-                <w:highlight w:val="yellow"/>
-                <w:bdr w:val="none" w:sz="0" w:space="0" w:color="auto" w:frame="1"/>
-                <w:lang w:eastAsia="fr-FR"/>
-              </w:rPr>
-              <w:t>des données et analyse</w:t>
+              <w:t>Première consolidation des données et analyse</w:t>
             </w:r>
           </w:p>
         </w:tc>
@@ -2970,7 +2990,15 @@
                 <w:rFonts w:ascii="Arial" w:eastAsia="Times New Roman" w:hAnsi="Arial" w:cs="Arial"/>
                 <w:lang w:eastAsia="fr-FR"/>
               </w:rPr>
-              <w:t>; arbitrage sur les cas incomplets</w:t>
+              <w:t xml:space="preserve">; arbitrage </w:t>
+            </w:r>
+            <w:r>
+              <w:rPr>
+                <w:rFonts w:ascii="Arial" w:eastAsia="Times New Roman" w:hAnsi="Arial" w:cs="Arial"/>
+                <w:lang w:eastAsia="fr-FR"/>
+              </w:rPr>
+              <w:lastRenderedPageBreak/>
+              <w:t>sur les cas incomplets</w:t>
             </w:r>
             <w:r>
               <w:rPr>
@@ -3004,6 +3032,7 @@
                 <w:rFonts w:ascii="Arial" w:eastAsia="Times New Roman" w:hAnsi="Arial" w:cs="Arial"/>
                 <w:lang w:eastAsia="fr-FR"/>
               </w:rPr>
+              <w:lastRenderedPageBreak/>
               <w:t>Bases stabilisées et exploitables</w:t>
             </w:r>
           </w:p>
@@ -3092,15 +3121,7 @@
                 <w:rFonts w:ascii="Arial" w:eastAsia="Times New Roman" w:hAnsi="Arial" w:cs="Arial"/>
                 <w:lang w:eastAsia="fr-FR"/>
               </w:rPr>
-              <w:t xml:space="preserve">; consolidation par projet, catégorie et </w:t>
-            </w:r>
-            <w:r>
-              <w:rPr>
-                <w:rFonts w:ascii="Arial" w:eastAsia="Times New Roman" w:hAnsi="Arial" w:cs="Arial"/>
-                <w:lang w:eastAsia="fr-FR"/>
-              </w:rPr>
-              <w:lastRenderedPageBreak/>
-              <w:t>bloc</w:t>
+              <w:t>; consolidation par projet, catégorie et bloc</w:t>
             </w:r>
             <w:r>
               <w:rPr>
@@ -3134,7 +3155,6 @@
                 <w:rFonts w:ascii="Arial" w:eastAsia="Times New Roman" w:hAnsi="Arial" w:cs="Arial"/>
                 <w:lang w:eastAsia="fr-FR"/>
               </w:rPr>
-              <w:lastRenderedPageBreak/>
               <w:t>Tableau consolidé des indicateurs produit</w:t>
             </w:r>
           </w:p>
@@ -3272,7 +3292,6 @@
                 <w:rFonts w:ascii="Arial" w:eastAsia="Times New Roman" w:hAnsi="Arial" w:cs="Arial"/>
                 <w:b/>
                 <w:bCs/>
-                <w:highlight w:val="yellow"/>
                 <w:lang w:eastAsia="fr-FR"/>
               </w:rPr>
             </w:pPr>
@@ -3281,7 +3300,6 @@
                 <w:rFonts w:ascii="Arial" w:eastAsia="Times New Roman" w:hAnsi="Arial" w:cs="Arial"/>
                 <w:b/>
                 <w:bCs/>
-                <w:highlight w:val="yellow"/>
                 <w:lang w:eastAsia="fr-FR"/>
               </w:rPr>
               <w:t>Phase 2</w:t>
@@ -3300,7 +3318,6 @@
                 <w:rFonts w:ascii="Arial" w:eastAsia="Times New Roman" w:hAnsi="Arial" w:cs="Arial"/>
                 <w:b/>
                 <w:bCs/>
-                <w:highlight w:val="yellow"/>
                 <w:lang w:eastAsia="fr-FR"/>
               </w:rPr>
             </w:pPr>
@@ -3309,60 +3326,9 @@
                 <w:rFonts w:ascii="Arial" w:eastAsia="Times New Roman" w:hAnsi="Arial" w:cs="Arial"/>
                 <w:b/>
                 <w:bCs/>
-                <w:highlight w:val="yellow"/>
-                <w:lang w:eastAsia="fr-FR"/>
-              </w:rPr>
-              <w:t>A</w:t>
-            </w:r>
-            <w:r>
-              <w:rPr>
-                <w:rFonts w:ascii="Arial" w:eastAsia="Times New Roman" w:hAnsi="Arial" w:cs="Arial"/>
-                <w:b/>
-                <w:bCs/>
-                <w:highlight w:val="yellow"/>
-                <w:lang w:eastAsia="fr-FR"/>
-              </w:rPr>
-              <w:t>pprofondi</w:t>
-            </w:r>
-            <w:r>
-              <w:rPr>
-                <w:rFonts w:ascii="Arial" w:eastAsia="Times New Roman" w:hAnsi="Arial" w:cs="Arial"/>
-                <w:b/>
-                <w:bCs/>
-                <w:highlight w:val="yellow"/>
-                <w:lang w:eastAsia="fr-FR"/>
-              </w:rPr>
-              <w:t>ssement des analyses</w:t>
-            </w:r>
-            <w:r>
-              <w:rPr>
-                <w:rFonts w:ascii="Arial" w:eastAsia="Times New Roman" w:hAnsi="Arial" w:cs="Arial"/>
-                <w:b/>
-                <w:bCs/>
-                <w:highlight w:val="yellow"/>
-                <w:lang w:eastAsia="fr-FR"/>
-              </w:rPr>
-              <w:t xml:space="preserve"> </w:t>
-            </w:r>
-            <w:r>
-              <w:rPr>
-                <w:rFonts w:ascii="Arial" w:eastAsia="Times New Roman" w:hAnsi="Arial" w:cs="Arial"/>
-                <w:b/>
-                <w:bCs/>
-                <w:highlight w:val="yellow"/>
-                <w:lang w:eastAsia="fr-FR"/>
-              </w:rPr>
-              <w:t xml:space="preserve">et </w:t>
-            </w:r>
-            <w:r>
-              <w:rPr>
-                <w:rFonts w:ascii="Arial" w:eastAsia="Times New Roman" w:hAnsi="Arial" w:cs="Arial"/>
-                <w:b/>
-                <w:bCs/>
-                <w:highlight w:val="yellow"/>
-                <w:lang w:eastAsia="fr-FR"/>
-              </w:rPr>
-              <w:t>tableau de bord dynamique</w:t>
+                <w:lang w:eastAsia="fr-FR"/>
+              </w:rPr>
+              <w:t>Approfondissement des analyses et tableau de bord dynamique</w:t>
             </w:r>
           </w:p>
         </w:tc>
@@ -3387,16 +3353,7 @@
                 <w:bCs/>
                 <w:lang w:eastAsia="fr-FR"/>
               </w:rPr>
-              <w:t xml:space="preserve">A partir du </w:t>
-            </w:r>
-            <w:r>
-              <w:rPr>
-                <w:rFonts w:ascii="Arial" w:eastAsia="Times New Roman" w:hAnsi="Arial" w:cs="Arial"/>
-                <w:b/>
-                <w:bCs/>
-                <w:lang w:eastAsia="fr-FR"/>
-              </w:rPr>
-              <w:t>15</w:t>
+              <w:t>A partir du 15</w:t>
             </w:r>
           </w:p>
         </w:tc>
@@ -3435,13 +3392,7 @@
               <w:rPr>
                 <w:rFonts w:ascii="Arial" w:hAnsi="Arial" w:cs="Arial"/>
               </w:rPr>
-              <w:t>C</w:t>
-            </w:r>
-            <w:r>
-              <w:rPr>
-                <w:rFonts w:ascii="Arial" w:hAnsi="Arial" w:cs="Arial"/>
-              </w:rPr>
-              <w:t>ollecte des données dans un processus permanent de suivi, reposant sur une collecte continue, organisée et systématique des informations utiles à la documentation des indicateurs</w:t>
+              <w:t>Collecte des données dans un processus permanent de suivi, reposant sur une collecte continue, organisée et systématique des informations utiles à la documentation des indicateurs</w:t>
             </w:r>
           </w:p>
         </w:tc>
@@ -3485,7 +3436,7 @@
 </file>
 
 <file path=word/numbering.xml><?xml version="1.0" encoding="utf-8"?>
-<w:numbering xmlns:wpc="http://schemas.microsoft.com/office/word/2010/wordprocessingCanvas" xmlns:cx="http://schemas.microsoft.com/office/drawing/2014/chartex" xmlns:cx1="http://schemas.microsoft.com/office/drawing/2015/9/8/chartex" xmlns:cx2="http://schemas.microsoft.com/office/drawing/2015/10/21/chartex" xmlns:cx3="http://schemas.microsoft.com/office/drawing/2016/5/9/chartex" xmlns:cx4="http://schemas.microsoft.com/office/drawing/2016/5/10/chartex" xmlns:cx5="http://schemas.microsoft.com/office/drawing/2016/5/11/chartex" xmlns:cx6="http://schemas.microsoft.com/office/drawing/2016/5/12/chartex" xmlns:cx7="http://schemas.microsoft.com/office/drawing/2016/5/13/chartex" xmlns:cx8="http://schemas.microsoft.com/office/drawing/2016/5/14/chartex" xmlns:mc="http://schemas.openxmlformats.org/markup-compatibility/2006" xmlns:aink="http://schemas.microsoft.com/office/drawing/2016/ink" xmlns:am3d="http://schemas.microsoft.com/office/drawing/2017/model3d" xmlns:o="urn:schemas-microsoft-com:office:office" xmlns:r="http://schemas.openxmlformats.org/officeDocument/2006/relationships" xmlns:m="http://schemas.openxmlformats.org/officeDocument/2006/math" xmlns:v="urn:schemas-microsoft-com:vml" xmlns:wp14="http://schemas.microsoft.com/office/word/2010/wordprocessingDrawing" xmlns:wp="http://schemas.openxmlformats.org/drawingml/2006/wordprocessingDrawing" xmlns:w10="urn:schemas-microsoft-com:office:word" xmlns:w="http://schemas.openxmlformats.org/wordprocessingml/2006/main" xmlns:w14="http://schemas.microsoft.com/office/word/2010/wordml" xmlns:w15="http://schemas.microsoft.com/office/word/2012/wordml" xmlns:w16cex="http://schemas.microsoft.com/office/word/2018/wordml/cex" xmlns:w16cid="http://schemas.microsoft.com/office/word/2016/wordml/cid" xmlns:w16="http://schemas.microsoft.com/office/word/2018/wordml" xmlns:w16sdtdh="http://schemas.microsoft.com/office/word/2020/wordml/sdtdatahash" xmlns:w16se="http://schemas.microsoft.com/office/word/2015/wordml/symex" xmlns:wpg="http://schemas.microsoft.com/office/word/2010/wordprocessingGroup" xmlns:wpi="http://schemas.microsoft.com/office/word/2010/wordprocessingInk" xmlns:wne="http://schemas.microsoft.com/office/word/2006/wordml" xmlns:wps="http://schemas.microsoft.com/office/word/2010/wordprocessingShape" mc:Ignorable="w14 w15 w16se w16cid w16 w16cex w16sdtdh wp14">
+<w:numbering xmlns:wpc="http://schemas.microsoft.com/office/word/2010/wordprocessingCanvas" xmlns:cx="http://schemas.microsoft.com/office/drawing/2014/chartex" xmlns:cx1="http://schemas.microsoft.com/office/drawing/2015/9/8/chartex" xmlns:cx2="http://schemas.microsoft.com/office/drawing/2015/10/21/chartex" xmlns:cx3="http://schemas.microsoft.com/office/drawing/2016/5/9/chartex" xmlns:cx4="http://schemas.microsoft.com/office/drawing/2016/5/10/chartex" xmlns:cx5="http://schemas.microsoft.com/office/drawing/2016/5/11/chartex" xmlns:cx6="http://schemas.microsoft.com/office/drawing/2016/5/12/chartex" xmlns:cx7="http://schemas.microsoft.com/office/drawing/2016/5/13/chartex" xmlns:cx8="http://schemas.microsoft.com/office/drawing/2016/5/14/chartex" xmlns:mc="http://schemas.openxmlformats.org/markup-compatibility/2006" xmlns:aink="http://schemas.microsoft.com/office/drawing/2016/ink" xmlns:am3d="http://schemas.microsoft.com/office/drawing/2017/model3d" xmlns:o="urn:schemas-microsoft-com:office:office" xmlns:oel="http://schemas.microsoft.com/office/2019/extlst" xmlns:r="http://schemas.openxmlformats.org/officeDocument/2006/relationships" xmlns:m="http://schemas.openxmlformats.org/officeDocument/2006/math" xmlns:v="urn:schemas-microsoft-com:vml" xmlns:wp14="http://schemas.microsoft.com/office/word/2010/wordprocessingDrawing" xmlns:wp="http://schemas.openxmlformats.org/drawingml/2006/wordprocessingDrawing" xmlns:w10="urn:schemas-microsoft-com:office:word" xmlns:w="http://schemas.openxmlformats.org/wordprocessingml/2006/main" xmlns:w14="http://schemas.microsoft.com/office/word/2010/wordml" xmlns:w15="http://schemas.microsoft.com/office/word/2012/wordml" xmlns:w16cex="http://schemas.microsoft.com/office/word/2018/wordml/cex" xmlns:w16cid="http://schemas.microsoft.com/office/word/2016/wordml/cid" xmlns:w16="http://schemas.microsoft.com/office/word/2018/wordml" xmlns:w16du="http://schemas.microsoft.com/office/word/2023/wordml/word16du" xmlns:w16sdtdh="http://schemas.microsoft.com/office/word/2020/wordml/sdtdatahash" xmlns:w16sdtfl="http://schemas.microsoft.com/office/word/2024/wordml/sdtformatlock" xmlns:w16se="http://schemas.microsoft.com/office/word/2015/wordml/symex" xmlns:wpg="http://schemas.microsoft.com/office/word/2010/wordprocessingGroup" xmlns:wpi="http://schemas.microsoft.com/office/word/2010/wordprocessingInk" xmlns:wne="http://schemas.microsoft.com/office/word/2006/wordml" xmlns:wps="http://schemas.microsoft.com/office/word/2010/wordprocessingShape" mc:Ignorable="w14 w15 w16se w16cid w16 w16cex w16sdtdh w16sdtfl w16du wp14">
   <w:abstractNum w:abstractNumId="0" w15:restartNumberingAfterBreak="0">
     <w:nsid w:val="3DFD506D"/>
     <w:multiLevelType w:val="multilevel"/>
@@ -3635,14 +3586,14 @@
       </w:rPr>
     </w:lvl>
   </w:abstractNum>
-  <w:num w:numId="1">
+  <w:num w:numId="1" w16cid:durableId="2056542652">
     <w:abstractNumId w:val="0"/>
   </w:num>
 </w:numbering>
 </file>
 
 <file path=word/styles.xml><?xml version="1.0" encoding="utf-8"?>
-<w:styles xmlns:mc="http://schemas.openxmlformats.org/markup-compatibility/2006" xmlns:r="http://schemas.openxmlformats.org/officeDocument/2006/relationships" xmlns:w="http://schemas.openxmlformats.org/wordprocessingml/2006/main" xmlns:w14="http://schemas.microsoft.com/office/word/2010/wordml" xmlns:w15="http://schemas.microsoft.com/office/word/2012/wordml" xmlns:w16cex="http://schemas.microsoft.com/office/word/2018/wordml/cex" xmlns:w16cid="http://schemas.microsoft.com/office/word/2016/wordml/cid" xmlns:w16="http://schemas.microsoft.com/office/word/2018/wordml" xmlns:w16sdtdh="http://schemas.microsoft.com/office/word/2020/wordml/sdtdatahash" xmlns:w16se="http://schemas.microsoft.com/office/word/2015/wordml/symex" mc:Ignorable="w14 w15 w16se w16cid w16 w16cex w16sdtdh">
+<w:styles xmlns:mc="http://schemas.openxmlformats.org/markup-compatibility/2006" xmlns:r="http://schemas.openxmlformats.org/officeDocument/2006/relationships" xmlns:w="http://schemas.openxmlformats.org/wordprocessingml/2006/main" xmlns:w14="http://schemas.microsoft.com/office/word/2010/wordml" xmlns:w15="http://schemas.microsoft.com/office/word/2012/wordml" xmlns:w16cex="http://schemas.microsoft.com/office/word/2018/wordml/cex" xmlns:w16cid="http://schemas.microsoft.com/office/word/2016/wordml/cid" xmlns:w16="http://schemas.microsoft.com/office/word/2018/wordml" xmlns:w16du="http://schemas.microsoft.com/office/word/2023/wordml/word16du" xmlns:w16sdtdh="http://schemas.microsoft.com/office/word/2020/wordml/sdtdatahash" xmlns:w16sdtfl="http://schemas.microsoft.com/office/word/2024/wordml/sdtformatlock" xmlns:w16se="http://schemas.microsoft.com/office/word/2015/wordml/symex" mc:Ignorable="w14 w15 w16se w16cid w16 w16cex w16sdtdh w16sdtfl w16du">
   <w:docDefaults>
     <w:rPrDefault>
       <w:rPr>

</xml_diff>